<commit_message>
Translate Faculty Council Work Plan 2025-2026 to Uzbek
Translated all paragraphs and 77-row work plan table covering 11 monthly
council meetings (August 2025 - June 2026), including agenda items,
responsible persons, preparers, and presenters for each session.

Co-Authored-By: Claude Opus 4.6 <noreply@anthropic.com>
Claude-Session: https://claude.ai/code/session_01N9ZP28hxEfPoWHf2qaE8QM
</commit_message>
<xml_diff>
--- a/Computer Engineering, Software Engineering, Computer systems & their softwares/Annexes/Annex №19 Faculty Council Meeting Protocol/4. Faculty of Information Technologies Council Work Plan 2025-2026 (EN).docx
+++ b/Computer Engineering, Software Engineering, Computer systems & their softwares/Annexes/Annex №19 Faculty Council Meeting Protocol/4. Faculty of Information Technologies Council Work Plan 2025-2026 (EN).docx
@@ -1,56 +1,5 @@
 
-<file path=docProps\app.xml><?xml version="1.0" encoding="utf-8"?>
-<Properties xmlns="http://schemas.openxmlformats.org/officeDocument/2006/extended-properties" xmlns:vt="http://schemas.openxmlformats.org/officeDocument/2006/docPropsVTypes">
-  <Template>Normal</Template>
-  <TotalTime>0</TotalTime>
-  <Pages>3</Pages>
-  <Words>2338</Words>
-  <Characters>13330</Characters>
-  <Application>Microsoft Office Word</Application>
-  <DocSecurity>0</DocSecurity>
-  <Lines>111</Lines>
-  <Paragraphs>31</Paragraphs>
-  <ScaleCrop>false</ScaleCrop>
-  <HeadingPairs>
-    <vt:vector size="2" baseType="variant">
-      <vt:variant>
-        <vt:lpstr>Название</vt:lpstr>
-      </vt:variant>
-      <vt:variant>
-        <vt:i4>1</vt:i4>
-      </vt:variant>
-    </vt:vector>
-  </HeadingPairs>
-  <TitlesOfParts>
-    <vt:vector size="1" baseType="lpstr">
-      <vt:lpstr/>
-    </vt:vector>
-  </TitlesOfParts>
-  <Company/>
-  <LinksUpToDate>false</LinksUpToDate>
-  <CharactersWithSpaces>15637</CharactersWithSpaces>
-  <SharedDoc>false</SharedDoc>
-  <HyperlinksChanged>false</HyperlinksChanged>
-  <AppVersion>16.0000</AppVersion>
-</Properties>
-</file>
-
-<file path=docProps\core.xml><?xml version="1.0" encoding="utf-8"?>
-<cp:coreProperties xmlns:cp="http://schemas.openxmlformats.org/package/2006/metadata/core-properties" xmlns:dc="http://purl.org/dc/elements/1.1/" xmlns:dcterms="http://purl.org/dc/terms/" xmlns:dcmitype="http://purl.org/dc/dcmitype/" xmlns:xsi="http://www.w3.org/2001/XMLSchema-instance">
-  <dc:title/>
-  <dc:subject/>
-  <dc:creator>User</dc:creator>
-  <cp:keywords/>
-  <dc:description/>
-  <cp:lastModifiedBy>Farkhodbek Shaymanov</cp:lastModifiedBy>
-  <cp:revision>2</cp:revision>
-  <cp:lastPrinted>2026-08-26T10:33:00Z</cp:lastPrinted>
-  <dcterms:created xsi:type="dcterms:W3CDTF">2026-09-20T13:21:00Z</dcterms:created>
-  <dcterms:modified xsi:type="dcterms:W3CDTF">2026-09-20T13:21:00Z</dcterms:modified>
-</cp:coreProperties>
-</file>
-
-<file path=word\document.xml><?xml version="1.0" encoding="utf-8"?>
+<file path=word/document.xml><?xml version="1.0" encoding="utf-8"?>
 <w:document xmlns:wpc="http://schemas.microsoft.com/office/word/2010/wordprocessingCanvas" xmlns:cx="http://schemas.microsoft.com/office/drawing/2014/chartex" xmlns:cx1="http://schemas.microsoft.com/office/drawing/2015/9/8/chartex" xmlns:cx2="http://schemas.microsoft.com/office/drawing/2015/10/21/chartex" xmlns:cx3="http://schemas.microsoft.com/office/drawing/2016/5/9/chartex" xmlns:cx4="http://schemas.microsoft.com/office/drawing/2016/5/10/chartex" xmlns:cx5="http://schemas.microsoft.com/office/drawing/2016/5/11/chartex" xmlns:cx6="http://schemas.microsoft.com/office/drawing/2016/5/12/chartex" xmlns:cx7="http://schemas.microsoft.com/office/drawing/2016/5/13/chartex" xmlns:cx8="http://schemas.microsoft.com/office/drawing/2016/5/14/chartex" xmlns:mc="http://schemas.openxmlformats.org/markup-compatibility/2006" xmlns:aink="http://schemas.microsoft.com/office/drawing/2016/ink" xmlns:am3d="http://schemas.microsoft.com/office/drawing/2017/model3d" xmlns:o="urn:schemas-microsoft-com:office:office" xmlns:oel="http://schemas.microsoft.com/office/2019/extlst" xmlns:r="http://schemas.openxmlformats.org/officeDocument/2006/relationships" xmlns:m="http://schemas.openxmlformats.org/officeDocument/2006/math" xmlns:v="urn:schemas-microsoft-com:vml" xmlns:wp14="http://schemas.microsoft.com/office/word/2010/wordprocessingDrawing" xmlns:wp="http://schemas.openxmlformats.org/drawingml/2006/wordprocessingDrawing" xmlns:w10="urn:schemas-microsoft-com:office:word" xmlns:w="http://schemas.openxmlformats.org/wordprocessingml/2006/main" xmlns:w14="http://schemas.microsoft.com/office/word/2010/wordml" xmlns:w15="http://schemas.microsoft.com/office/word/2012/wordml" xmlns:w16cex="http://schemas.microsoft.com/office/word/2018/wordml/cex" xmlns:w16cid="http://schemas.microsoft.com/office/word/2016/wordml/cid" xmlns:w16="http://schemas.microsoft.com/office/word/2018/wordml" xmlns:w16sdtdh="http://schemas.microsoft.com/office/word/2020/wordml/sdtdatahash" xmlns:w16se="http://schemas.microsoft.com/office/word/2015/wordml/symex" xmlns:wpg="http://schemas.microsoft.com/office/word/2010/wordprocessingGroup" xmlns:wpi="http://schemas.microsoft.com/office/word/2010/wordprocessingInk" xmlns:wne="http://schemas.microsoft.com/office/word/2006/wordml" xmlns:wps="http://schemas.microsoft.com/office/word/2010/wordprocessingShape" mc:Ignorable="w14 w15 w16se w16cid w16 w16cex w16sdtdh wp14">
   <w:body>
     <w:p>
@@ -78,7 +27,7 @@
           <w:szCs w:val="36"/>
           <w:lang w:val="uz-Latn-UZ"/>
         </w:rPr>
-        <w:t>REPUBLIC OF</w:t>
+        <w:t xml:space="preserve">O'ZBEKISTON RESPUBLIKASI </w:t>
       </w:r>
       <w:r>
         <w:rPr>
@@ -90,7 +39,6 @@
           <w:szCs w:val="28"/>
           <w:lang w:val="uz-Latn-UZ"/>
         </w:rPr>
-        <w:t xml:space="preserve"> UZBEKISTAN </w:t>
       </w:r>
     </w:p>
     <w:p>
@@ -115,7 +63,7 @@
           <w:szCs w:val="28"/>
           <w:lang w:val="uz-Latn-UZ"/>
         </w:rPr>
-        <w:t xml:space="preserve">MINISTRY OF HIGHER EDUCATION, SCIENCE AND INNOVATION </w:t>
+        <w:t xml:space="preserve">OLIY TA'LIM, FAN VA INNOVATSIYALAR VAZIRLIGI </w:t>
       </w:r>
     </w:p>
     <w:p>
@@ -140,7 +88,7 @@
           <w:szCs w:val="28"/>
           <w:lang w:val="uz-Latn-UZ"/>
         </w:rPr>
-        <w:t xml:space="preserve">TERMEZ STATE UNIVERSITY</w:t>
+        <w:t>TERMIZ DAVLAT UNIVERSITETI</w:t>
       </w:r>
     </w:p>
     <w:p>
@@ -197,7 +145,7 @@
           <w:szCs w:val="28"/>
           <w:lang w:val="uz-Latn-UZ"/>
         </w:rPr>
-        <w:t xml:space="preserve"> </w:t>
+        <w:t xml:space="preserve"> "TASDIQLANDI"</w:t>
       </w:r>
       <w:r>
         <w:rPr>
@@ -208,7 +156,6 @@
           <w:szCs w:val="28"/>
           <w:lang w:val="uz-Latn-UZ"/>
         </w:rPr>
-        <w:t>"APPROVED"</w:t>
       </w:r>
     </w:p>
     <w:p>
@@ -234,7 +181,7 @@
           <w:szCs w:val="28"/>
           <w:lang w:val="uz-Latn-UZ"/>
         </w:rPr>
-        <w:t xml:space="preserve"> Termez State University </w:t>
+        <w:t xml:space="preserve"> Termiz davlat universiteti </w:t>
       </w:r>
     </w:p>
     <w:p>
@@ -260,7 +207,7 @@
           <w:szCs w:val="28"/>
           <w:lang w:val="uz-Latn-UZ"/>
         </w:rPr>
-        <w:t xml:space="preserve">        Rector____________ A.H. Toshkulov</w:t>
+        <w:t xml:space="preserve">         Rektor____________ A.H. Toshqulov</w:t>
       </w:r>
     </w:p>
     <w:p>
@@ -287,7 +234,7 @@
           <w:szCs w:val="28"/>
           <w:lang w:val="uz-Latn-UZ"/>
         </w:rPr>
-        <w:t xml:space="preserve">        </w:t>
+        <w:t xml:space="preserve">         2025-yil 29-avgust </w:t>
       </w:r>
       <w:r>
         <w:rPr>
@@ -299,7 +246,6 @@
           <w:u w:val="single"/>
           <w:lang w:val="uz-Latn-UZ"/>
         </w:rPr>
-        <w:t xml:space="preserve">29 August 202</w:t>
       </w:r>
       <w:r>
         <w:rPr>
@@ -311,7 +257,6 @@
           <w:u w:val="single"/>
           <w:lang w:val="en-US"/>
         </w:rPr>
-        <w:t>5</w:t>
       </w:r>
       <w:r>
         <w:rPr>
@@ -323,7 +268,6 @@
           <w:u w:val="single"/>
           <w:lang w:val="uz-Latn-UZ"/>
         </w:rPr>
-        <w:t xml:space="preserve"> </w:t>
       </w:r>
     </w:p>
     <w:p>
@@ -422,7 +366,7 @@
           <w:szCs w:val="40"/>
           <w:lang w:val="uz-Latn-UZ"/>
         </w:rPr>
-        <w:t xml:space="preserve">FACULTY OF INFORMATION TECHNOLOGIES</w:t>
+        <w:t>AXBOROT TEXNOLOGIYALARI FAKULTETI</w:t>
       </w:r>
     </w:p>
     <w:p>
@@ -447,7 +391,7 @@
           <w:szCs w:val="40"/>
           <w:lang w:val="uz-Latn-UZ"/>
         </w:rPr>
-        <w:t xml:space="preserve">COUNCIL </w:t>
+        <w:t>KENGASH ISH REJASI 2025-2026</w:t>
       </w:r>
       <w:r>
         <w:rPr>
@@ -457,7 +401,6 @@
           <w:szCs w:val="40"/>
           <w:lang w:val="uz-Latn-UZ"/>
         </w:rPr>
-        <w:t xml:space="preserve">WORK PLAN FOR THE 2025-2026</w:t>
       </w:r>
     </w:p>
     <w:p>
@@ -482,7 +425,7 @@
           <w:szCs w:val="40"/>
           <w:lang w:val="uz-Latn-UZ"/>
         </w:rPr>
-        <w:t xml:space="preserve">ACADEMIC YEAR</w:t>
+        <w:t>O'QUV YILI UCHUN</w:t>
       </w:r>
     </w:p>
     <w:p>
@@ -645,7 +588,7 @@
           <w:sz w:val="32"/>
           <w:lang w:val="uz-Latn-UZ"/>
         </w:rPr>
-        <w:t xml:space="preserve">TERMEZ – 2025.</w:t>
+        <w:t>TERMIZ – 2025.</w:t>
       </w:r>
     </w:p>
     <w:p>
@@ -700,8 +643,13 @@
                 <w:szCs w:val="28"/>
                 <w:lang w:val="uz-Latn-UZ"/>
               </w:rPr>
-              <w:lastRenderedPageBreak/>
-              <w:t xml:space="preserve">       "APPROVED"</w:t>
+              <w:t>"TASDIQLANDI"</w:t>
+              <w:br/>
+              <w:t xml:space="preserve">     Termiz davlat universiteti </w:t>
+              <w:br/>
+              <w:t xml:space="preserve">Axborot texnologiyalari fakulteti           Dekan_________ F.T. Djumayev </w:t>
+              <w:br/>
+              <w:t xml:space="preserve">            2025-yil 29-avgust</w:t>
             </w:r>
           </w:p>
           <w:p>
@@ -838,7 +786,7 @@
                 <w:szCs w:val="28"/>
                 <w:lang w:val="uz-Latn-UZ" w:eastAsia="ru-RU"/>
               </w:rPr>
-              <w:t xml:space="preserve">TERMEZ STATE UNIVERSITY, FACULTY OF INFORMATION </w:t>
+              <w:t>TERMIZ DAVLAT UNIVERSITETI, AXBOROT TEXNOLOGIYALARI FAKULTETI KENGASHI ISH REJASI 2025-2026 O'QUV YILI UCHUN</w:t>
             </w:r>
             <w:r>
               <w:rPr>
@@ -848,7 +796,6 @@
                 <w:szCs w:val="28"/>
                 <w:lang w:val="uz-Latn-UZ" w:eastAsia="ru-RU"/>
               </w:rPr>
-              <w:t xml:space="preserve">TECHNOLOGIES </w:t>
             </w:r>
             <w:r>
               <w:rPr>
@@ -857,7 +804,6 @@
                 <w:szCs w:val="28"/>
                 <w:lang w:val="uz-Latn-UZ" w:eastAsia="ru-RU"/>
               </w:rPr>
-              <w:t xml:space="preserve">COUNCIL WORK PLAN FOR THE 2025-2026 ACADEMIC YEAR</w:t>
             </w:r>
           </w:p>
         </w:tc>
@@ -922,7 +868,7 @@
                 <w:szCs w:val="28"/>
                 <w:lang w:val="uz-Latn-UZ"/>
               </w:rPr>
-              <w:t>No.</w:t>
+              <w:t>T/r</w:t>
             </w:r>
           </w:p>
         </w:tc>
@@ -955,7 +901,7 @@
                 <w:szCs w:val="28"/>
                 <w:lang w:val="uz-Latn-UZ"/>
               </w:rPr>
-              <w:t xml:space="preserve">Agenda Item</w:t>
+              <w:t>Kun tartibi masalasi</w:t>
             </w:r>
           </w:p>
         </w:tc>
@@ -988,7 +934,7 @@
                 <w:szCs w:val="28"/>
                 <w:lang w:val="uz-Latn-UZ"/>
               </w:rPr>
-              <w:t xml:space="preserve">Responsible </w:t>
+              <w:t>Mas'ul</w:t>
             </w:r>
           </w:p>
         </w:tc>
@@ -1021,7 +967,7 @@
                 <w:szCs w:val="28"/>
                 <w:lang w:val="uz-Latn-UZ"/>
               </w:rPr>
-              <w:t xml:space="preserve">Preparer(s)</w:t>
+              <w:t>Tayyorlovchi(lar)</w:t>
             </w:r>
           </w:p>
         </w:tc>
@@ -1054,7 +1000,7 @@
                 <w:szCs w:val="28"/>
                 <w:lang w:val="uz-Latn-UZ"/>
               </w:rPr>
-              <w:t>Presenter</w:t>
+              <w:t>Ma'ruzachi</w:t>
             </w:r>
           </w:p>
         </w:tc>
@@ -1094,7 +1040,7 @@
                 <w:szCs w:val="28"/>
                 <w:lang w:val="uz-Latn-UZ" w:eastAsia="ru-RU"/>
               </w:rPr>
-              <w:t xml:space="preserve">First Meeting – August 2025</w:t>
+              <w:t>Birinchi yig'ilish – 2025-yil avgust</w:t>
             </w:r>
           </w:p>
         </w:tc>
@@ -1152,7 +1098,7 @@
                 <w:rFonts w:ascii="Times New Roman" w:hAnsi="Times New Roman"/>
                 <w:lang w:val="uz-Latn-UZ"/>
               </w:rPr>
-              <w:t xml:space="preserve">On preparation for the 2025/2026 academic year, ensuring the efficiency of the educational process, and the tasks of the faculty team for the current academic year</w:t>
+              <w:t>2025/2026 o'quv yiliga tayyorgarlik, o'quv jarayoni samaradorligini ta'minlash va joriy o'quv yili uchun fakultet jamoasining vazifalari to'g'risida</w:t>
             </w:r>
           </w:p>
         </w:tc>
@@ -1183,7 +1129,7 @@
                 <w:szCs w:val="28"/>
                 <w:lang w:val="uz-Latn-UZ"/>
               </w:rPr>
-              <w:t>Dean of the Faculty</w:t>
+              <w:t>Fakultet dekani</w:t>
             </w:r>
           </w:p>
           <w:p>
@@ -1311,7 +1257,7 @@
                 <w:rFonts w:ascii="Times New Roman" w:hAnsi="Times New Roman"/>
                 <w:lang w:val="uz-Latn-UZ"/>
               </w:rPr>
-              <w:t>On the status of preparation for organizing the educational process at the faculty for the 2025/2026 academic year: curricula, distribution of courses, teaching load of faculty members, class schedules, classrooms, and preparation of course resources</w:t>
+              <w:t>2025/2026 o'quv yili uchun fakultetda o'quv jarayonini tashkil etishga tayyorgarlik holati: o'quv rejalari, fanlarni taqsimlash, professor-o'qituvchilarning o'quv yuklamasi, dars jadvallari, o'quv xonalari va fan resurslari tayyorlash</w:t>
             </w:r>
           </w:p>
         </w:tc>
@@ -1340,7 +1286,7 @@
                 <w:rFonts w:ascii="Times New Roman" w:hAnsi="Times New Roman"/>
                 <w:lang w:val="uz-Latn-UZ"/>
               </w:rPr>
-              <w:t>Registrar's Office Manager assigned to the Faculty</w:t>
+              <w:t>Fakultetga biriktirilgan ro'yxatga olish bo'limi boshqaruvchisi</w:t>
             </w:r>
           </w:p>
         </w:tc>
@@ -1474,7 +1420,7 @@
                 <w:rFonts w:ascii="Times New Roman" w:hAnsi="Times New Roman"/>
                 <w:lang w:val="uz-Latn-UZ"/>
               </w:rPr>
-              <w:t xml:space="preserve">Approval of departments' work plans for the new 2025/2026 academic year and of faculty members' educational-normative documents</w:t>
+              <w:t>Yangi 2025/2026 o'quv yili uchun kafedralar ish rejalari va professor-o'qituvchilarning o'quv-me'yoriy hujjatlarini tasdiqlash</w:t>
             </w:r>
           </w:p>
         </w:tc>
@@ -1505,7 +1451,7 @@
                 <w:szCs w:val="28"/>
                 <w:lang w:val="uz-Latn-UZ" w:eastAsia="uz-Cyrl-UZ"/>
               </w:rPr>
-              <w:t>Heads of Departments</w:t>
+              <w:t>Kafedra mudirlari</w:t>
             </w:r>
           </w:p>
           <w:p>
@@ -1558,7 +1504,7 @@
                 <w:szCs w:val="28"/>
                 <w:lang w:val="uz-Latn-UZ" w:eastAsia="uz-Cyrl-UZ"/>
               </w:rPr>
-              <w:t>Heads of Departments</w:t>
+              <w:t>Kafedra mudirlari</w:t>
             </w:r>
           </w:p>
         </w:tc>
@@ -1589,7 +1535,7 @@
                 <w:szCs w:val="28"/>
                 <w:lang w:val="uz-Latn-UZ" w:eastAsia="uz-Cyrl-UZ"/>
               </w:rPr>
-              <w:t>heads of departments</w:t>
+              <w:t>kafedra mudirlari</w:t>
             </w:r>
           </w:p>
         </w:tc>
@@ -1647,7 +1593,7 @@
                 <w:rFonts w:ascii="Times New Roman" w:hAnsi="Times New Roman"/>
                 <w:lang w:val="uz-Latn-UZ"/>
               </w:rPr>
-              <w:t>Approval of the Faculty Council's work plan</w:t>
+              <w:t>Fakultet kengashi ish rejasini tasdiqlash</w:t>
             </w:r>
           </w:p>
         </w:tc>
@@ -1674,7 +1620,9 @@
                 <w:rFonts w:ascii="Times New Roman" w:hAnsi="Times New Roman"/>
                 <w:lang w:val="uz-Latn-UZ"/>
               </w:rPr>
-              <w:t xml:space="preserve">Dean of the Faculty, </w:t>
+              <w:t xml:space="preserve">Fakultet dekani, </w:t>
+              <w:br/>
+              <w:t>Ilmiy kotib</w:t>
             </w:r>
           </w:p>
           <w:p>
@@ -1829,7 +1777,7 @@
                 <w:rFonts w:ascii="Times New Roman" w:hAnsi="Times New Roman"/>
                 <w:lang w:val="uz-Latn-UZ"/>
               </w:rPr>
-              <w:t>Approval of the work plans of faculty public organizations</w:t>
+              <w:t>Fakultet jamoat tashkilotlari ish rejalarini tasdiqlash</w:t>
             </w:r>
           </w:p>
         </w:tc>
@@ -1857,7 +1805,7 @@
                 <w:rFonts w:ascii="Times New Roman" w:hAnsi="Times New Roman"/>
                 <w:lang w:val="uz-Latn-UZ"/>
               </w:rPr>
-              <w:t>Heads of Public Organizations</w:t>
+              <w:t>Jamoat tashkilotlari rahbarlari</w:t>
             </w:r>
           </w:p>
         </w:tc>
@@ -1886,7 +1834,7 @@
                 <w:rFonts w:ascii="Times New Roman" w:hAnsi="Times New Roman"/>
                 <w:lang w:val="uz-Latn-UZ"/>
               </w:rPr>
-              <w:t>Heads of Public Organizations</w:t>
+              <w:t>Jamoat tashkilotlari rahbarlari</w:t>
             </w:r>
           </w:p>
         </w:tc>
@@ -1915,7 +1863,7 @@
                 <w:rFonts w:ascii="Times New Roman" w:hAnsi="Times New Roman"/>
                 <w:lang w:val="uz-Latn-UZ"/>
               </w:rPr>
-              <w:t>Heads of Public Organizations</w:t>
+              <w:t>Jamoat tashkilotlari rahbarlari</w:t>
             </w:r>
           </w:p>
         </w:tc>
@@ -1974,7 +1922,7 @@
                 <w:bCs/>
                 <w:lang w:val="uz-Latn-UZ"/>
               </w:rPr>
-              <w:t>On organizing work at the faculty for the 2025/2026 academic year on engaging student youth, supporting youth initiatives, and implementing youth projects</w:t>
+              <w:t>2025/2026 o'quv yili uchun fakultetda talaba yoshlarni jalb qilish, yoshlar tashabbuslarini qo'llab-quvvatlash va yoshlar loyihalarini amalga oshirish bo'yicha ishlarni tashkil etish to'g'risida</w:t>
             </w:r>
           </w:p>
         </w:tc>
@@ -2002,7 +1950,7 @@
                 <w:rFonts w:ascii="Times New Roman" w:hAnsi="Times New Roman"/>
                 <w:lang w:val="uz-Latn-UZ"/>
               </w:rPr>
-              <w:t>Leader of the Faculty Youth Union</w:t>
+              <w:t>Fakultet Yoshlar ittifoqi yetakchisi</w:t>
             </w:r>
           </w:p>
         </w:tc>
@@ -2030,7 +1978,7 @@
                 <w:rFonts w:ascii="Times New Roman" w:hAnsi="Times New Roman"/>
                 <w:lang w:val="uz-Latn-UZ"/>
               </w:rPr>
-              <w:t>Leader of the Faculty Youth Union</w:t>
+              <w:t>Fakultet Yoshlar ittifoqi yetakchisi</w:t>
             </w:r>
           </w:p>
         </w:tc>
@@ -2058,7 +2006,7 @@
                 <w:rFonts w:ascii="Times New Roman" w:hAnsi="Times New Roman"/>
                 <w:lang w:val="uz-Latn-UZ"/>
               </w:rPr>
-              <w:t>Leader of the Faculty Youth Union</w:t>
+              <w:t>Fakultet Yoshlar ittifoqi yetakchisi</w:t>
             </w:r>
           </w:p>
         </w:tc>
@@ -2117,7 +2065,7 @@
                 <w:rFonts w:ascii="Times New Roman" w:hAnsi="Times New Roman"/>
                 <w:lang w:val="uz-Latn-UZ"/>
               </w:rPr>
-              <w:t xml:space="preserve">Miscellaneous matters</w:t>
+              <w:t>Turli masalalar</w:t>
             </w:r>
           </w:p>
         </w:tc>
@@ -2220,7 +2168,7 @@
                 <w:szCs w:val="28"/>
                 <w:lang w:val="uz-Latn-UZ" w:eastAsia="ru-RU"/>
               </w:rPr>
-              <w:t xml:space="preserve">Second Meeting – September 2025</w:t>
+              <w:t>Ikkinchi yig'ilish – 2025-yil sentyabr</w:t>
             </w:r>
           </w:p>
         </w:tc>
@@ -2279,7 +2227,7 @@
                 <w:rFonts w:ascii="Times New Roman" w:hAnsi="Times New Roman"/>
                 <w:lang w:val="uz-Latn-UZ"/>
               </w:rPr>
-              <w:t xml:space="preserve">On the implementation at the faculty of the decrees of the President of the Republic of Uzbekistan, and the resolutions of the Cabinet of Ministers, the Ministry of Higher Education, Science and Innovation, and orders of the Rector of the University</w:t>
+              <w:t>O'zbekiston Respublikasi Prezidentining farmonlari, Vazirlar Mahkamasi, Oliy ta'lim, fan va innovatsiyalar vazirligi qarorlari va Universitet rektori buyruqlarining fakultetda bajarilishi to'g'risida</w:t>
             </w:r>
           </w:p>
         </w:tc>
@@ -2321,7 +2269,7 @@
                 <w:szCs w:val="28"/>
                 <w:lang w:val="uz-Latn-UZ"/>
               </w:rPr>
-              <w:t>Dean of the Faculty</w:t>
+              <w:t>Fakultet dekani</w:t>
             </w:r>
           </w:p>
           <w:p>
@@ -2471,7 +2419,7 @@
                 <w:rFonts w:ascii="Times New Roman" w:hAnsi="Times New Roman"/>
                 <w:lang w:val="uz-Latn-UZ"/>
               </w:rPr>
-              <w:t xml:space="preserve">On the status of fulfillment of the tasks set out in the target indicator strategy of the Faculty of Information Technologies for the 2025–2026 academic years</w:t>
+              <w:t>2025–2026 o'quv yillari uchun Axborot texnologiyalari fakulteti maqsadli ko'rsatkichlar strategiyasida belgilangan vazifalarning bajarilish holati to'g'risida</w:t>
             </w:r>
           </w:p>
         </w:tc>
@@ -2500,7 +2448,7 @@
                 <w:rFonts w:ascii="Times New Roman" w:hAnsi="Times New Roman"/>
                 <w:lang w:val="uz-Latn-UZ"/>
               </w:rPr>
-              <w:t>Heads of Departments</w:t>
+              <w:t>Kafedra mudirlari</w:t>
             </w:r>
           </w:p>
         </w:tc>
@@ -2530,7 +2478,7 @@
                 <w:szCs w:val="28"/>
                 <w:lang w:val="uz-Latn-UZ"/>
               </w:rPr>
-              <w:t>Heads of Departments</w:t>
+              <w:t>Kafedra mudirlari</w:t>
             </w:r>
           </w:p>
           <w:p>
@@ -2577,7 +2525,7 @@
                 <w:szCs w:val="28"/>
                 <w:lang w:val="uz-Latn-UZ"/>
               </w:rPr>
-              <w:t>Heads of Departments</w:t>
+              <w:t>Kafedra mudirlari</w:t>
             </w:r>
           </w:p>
           <w:p>
@@ -2646,7 +2594,7 @@
                 <w:rFonts w:ascii="Times New Roman" w:hAnsi="Times New Roman"/>
                 <w:lang w:val="uz-Latn-UZ"/>
               </w:rPr>
-              <w:t xml:space="preserve">On the commencement of the 2025/2026 academic year and the organization of the educational process: distribution of students into groups, the start of classes, attendance, accuracy of data in HEMIS, and compliance of the educational process with normative documents</w:t>
+              <w:t>2025/2026 o'quv yilining boshlanishi va o'quv jarayonini tashkil etish: talabalarni guruhlarga taqsimlash, darslar boshlanishi, davomat, HEMIS'dagi ma'lumotlar aniqligi va o'quv jarayonining me'yoriy hujjatlarga muvofiqligi</w:t>
             </w:r>
           </w:p>
         </w:tc>
@@ -2675,7 +2623,7 @@
                 <w:rFonts w:ascii="Times New Roman" w:hAnsi="Times New Roman"/>
                 <w:lang w:val="uz-Latn-UZ"/>
               </w:rPr>
-              <w:t>Registrar's Office Manager assigned to the Faculty</w:t>
+              <w:t>Fakultetga biriktirilgan ro'yxatga olish bo'limi boshqaruvchisi</w:t>
             </w:r>
           </w:p>
         </w:tc>
@@ -2809,7 +2757,7 @@
                 <w:rFonts w:ascii="Times New Roman" w:hAnsi="Times New Roman"/>
                 <w:lang w:val="uz-Latn-UZ"/>
               </w:rPr>
-              <w:t>On the allocation and equipping of classrooms for student groups</w:t>
+              <w:t>Talaba guruhlari uchun o'quv xonalarini taqsimlash va jihozlash to'g'risida</w:t>
             </w:r>
           </w:p>
         </w:tc>
@@ -2837,7 +2785,7 @@
                 <w:rFonts w:ascii="Times New Roman" w:hAnsi="Times New Roman"/>
                 <w:lang w:val="uz-Latn-UZ"/>
               </w:rPr>
-              <w:t xml:space="preserve">Deputy Dean for Youth Affairs and Spiritual-Educational Work</w:t>
+              <w:t>Yoshlar ishlari va ma'naviy-ma'rifiy ish bo'yicha dekan o'rinbosari</w:t>
             </w:r>
           </w:p>
         </w:tc>
@@ -2951,7 +2899,7 @@
                 <w:rFonts w:ascii="Times New Roman" w:hAnsi="Times New Roman"/>
                 <w:lang w:val="uz-Latn-UZ"/>
               </w:rPr>
-              <w:t xml:space="preserve">Miscellaneous matters</w:t>
+              <w:t>Turli masalalar</w:t>
             </w:r>
           </w:p>
         </w:tc>
@@ -2978,7 +2926,7 @@
                 <w:rFonts w:ascii="Times New Roman" w:hAnsi="Times New Roman"/>
                 <w:lang w:val="uz-Latn-UZ"/>
               </w:rPr>
-              <w:t>Dean of the Faculty</w:t>
+              <w:t>Fakultet dekani</w:t>
             </w:r>
           </w:p>
         </w:tc>
@@ -3093,9 +3041,7 @@
                 <w:szCs w:val="28"/>
                 <w:lang w:val="uz-Latn-UZ"/>
               </w:rPr>
-              <w:tab/>
-              <w:tab/>
-              <w:t xml:space="preserve">Third Meeting – October 2025</w:t>
+              <w:t>Uchinchi yig'ilish – 2025-yil oktyabr</w:t>
             </w:r>
           </w:p>
         </w:tc>
@@ -3154,7 +3100,7 @@
                 <w:rFonts w:ascii="Times New Roman" w:hAnsi="Times New Roman"/>
                 <w:lang w:val="uz-Latn-UZ"/>
               </w:rPr>
-              <w:t xml:space="preserve">On the implementation at the faculty of the decrees of the President of the Republic of Uzbekistan, and the resolutions of the Cabinet of Ministers, the Ministry of Higher Education, Science and Innovation, and orders of the Rector of the University</w:t>
+              <w:t>O'zbekiston Respublikasi Prezidentining farmonlari, Vazirlar Mahkamasi, Oliy ta'lim, fan va innovatsiyalar vazirligi qarorlari va Universitet rektori buyruqlarining fakultetda bajarilishi to'g'risida</w:t>
             </w:r>
           </w:p>
         </w:tc>
@@ -3181,7 +3127,7 @@
                 <w:rFonts w:ascii="Times New Roman" w:hAnsi="Times New Roman"/>
                 <w:lang w:val="uz-Latn-UZ"/>
               </w:rPr>
-              <w:t>Dean of the Faculty</w:t>
+              <w:t>Fakultet dekani</w:t>
             </w:r>
           </w:p>
         </w:tc>
@@ -3291,7 +3237,7 @@
                 <w:rFonts w:ascii="Times New Roman" w:hAnsi="Times New Roman"/>
                 <w:lang w:val="uz-Latn-UZ"/>
               </w:rPr>
-              <w:t xml:space="preserve">On the status of fulfillment of the tasks set out in the target indicator strategy of the Faculty of Information Technologies for the 2025–2026 academic years</w:t>
+              <w:t>2025–2026 o'quv yillari uchun Axborot texnologiyalari fakulteti maqsadli ko'rsatkichlar strategiyasida belgilangan vazifalarning bajarilish holati to'g'risida</w:t>
             </w:r>
           </w:p>
         </w:tc>
@@ -3318,7 +3264,7 @@
                 <w:rFonts w:ascii="Times New Roman" w:hAnsi="Times New Roman"/>
                 <w:lang w:val="uz-Latn-UZ"/>
               </w:rPr>
-              <w:t xml:space="preserve">Head of Department </w:t>
+              <w:t>Kafedra mudiri</w:t>
             </w:r>
           </w:p>
           <w:p>
@@ -3354,7 +3300,7 @@
                 <w:rFonts w:ascii="Times New Roman" w:hAnsi="Times New Roman"/>
                 <w:lang w:val="uz-Latn-UZ"/>
               </w:rPr>
-              <w:t xml:space="preserve">Head of Department </w:t>
+              <w:t>Kafedra mudiri</w:t>
             </w:r>
           </w:p>
           <w:p>
@@ -3390,7 +3336,7 @@
                 <w:rFonts w:ascii="Times New Roman" w:hAnsi="Times New Roman"/>
                 <w:lang w:val="uz-Latn-UZ"/>
               </w:rPr>
-              <w:t xml:space="preserve">Head of Department </w:t>
+              <w:t>Kafedra mudiri</w:t>
             </w:r>
           </w:p>
           <w:p>
@@ -3458,7 +3404,7 @@
                 <w:rFonts w:ascii="Times New Roman" w:hAnsi="Times New Roman"/>
                 <w:lang w:val="uz-Latn-UZ"/>
               </w:rPr>
-              <w:t>On the state of course resources and educational-methodological support at the faculty: placement of course syllabi, educational materials, assignments, and assessment materials in the HEMIS/LMS systems, and the extent of student use thereof</w:t>
+              <w:t>Fakultetdagi fan resurslari va o'quv-uslubiy ta'minot holati: fan sillabuslarini, ta'lim materiallarini, topshiriqlarni va baholash materiallarini HEMIS/LMS tizimlarida joylashtirish va talabalar tomonidan foydalanish darajasi</w:t>
             </w:r>
           </w:p>
         </w:tc>
@@ -3485,7 +3431,7 @@
                 <w:rFonts w:ascii="Times New Roman" w:hAnsi="Times New Roman"/>
                 <w:lang w:val="uz-Latn-UZ"/>
               </w:rPr>
-              <w:t>Registrar's Office Manager assigned to the Faculty</w:t>
+              <w:t>Fakultetga biriktirilgan ro'yxatga olish bo'limi boshqaruvchisi</w:t>
             </w:r>
           </w:p>
         </w:tc>
@@ -3597,7 +3543,7 @@
                 <w:rFonts w:ascii="Times New Roman" w:hAnsi="Times New Roman"/>
                 <w:lang w:val="uz-Latn-UZ"/>
               </w:rPr>
-              <w:t xml:space="preserve">On the state of scientific work at the faculty for the 2025/2026 academic year and forthcoming tasks</w:t>
+              <w:t>2025/2026 o'quv yili uchun fakultetdagi ilmiy ish holati va kelgusi vazifalar to'g'risida</w:t>
             </w:r>
           </w:p>
         </w:tc>
@@ -3624,7 +3570,7 @@
                 <w:rFonts w:ascii="Times New Roman" w:hAnsi="Times New Roman"/>
                 <w:lang w:val="uz-Latn-UZ"/>
               </w:rPr>
-              <w:t xml:space="preserve">Head of Department </w:t>
+              <w:t>Kafedra mudiri</w:t>
             </w:r>
           </w:p>
           <w:p>
@@ -3660,7 +3606,7 @@
                 <w:rFonts w:ascii="Times New Roman" w:hAnsi="Times New Roman"/>
                 <w:lang w:val="uz-Latn-UZ"/>
               </w:rPr>
-              <w:t xml:space="preserve">Head of Department </w:t>
+              <w:t>Kafedra mudiri</w:t>
             </w:r>
           </w:p>
           <w:p>
@@ -3696,7 +3642,7 @@
                 <w:rFonts w:ascii="Times New Roman" w:hAnsi="Times New Roman"/>
                 <w:lang w:val="uz-Latn-UZ"/>
               </w:rPr>
-              <w:t xml:space="preserve">Head of Department </w:t>
+              <w:t>Kafedra mudiri</w:t>
             </w:r>
           </w:p>
           <w:p>
@@ -3763,7 +3709,7 @@
                 <w:rFonts w:ascii="Times New Roman" w:hAnsi="Times New Roman"/>
                 <w:lang w:val="uz-Latn-UZ"/>
               </w:rPr>
-              <w:t>On executive discipline</w:t>
+              <w:t>Ijro intizomi to'g'risida</w:t>
             </w:r>
           </w:p>
         </w:tc>
@@ -3791,7 +3737,7 @@
                 <w:rFonts w:ascii="Times New Roman" w:hAnsi="Times New Roman"/>
                 <w:lang w:val="uz-Latn-UZ"/>
               </w:rPr>
-              <w:t xml:space="preserve">Deputy Dean for Youth Affairs and Spiritual-Educational Work</w:t>
+              <w:t>Yoshlar ishlari va ma'naviy-ma'rifiy ish bo'yicha dekan o'rinbosari</w:t>
             </w:r>
           </w:p>
         </w:tc>
@@ -3915,7 +3861,7 @@
                 <w:rFonts w:ascii="Times New Roman" w:hAnsi="Times New Roman"/>
                 <w:lang w:val="uz-Latn-UZ"/>
               </w:rPr>
-              <w:t xml:space="preserve">On the state of educational, scientific, and spiritual-educational work conducted at the Departments of Mathematical Modeling and Computer Sciences, and of Computer and Software Engineering, and measures for its further improvement</w:t>
+              <w:t>Matematik modellashtirish va kompyuter fanlari hamda Kompyuter va dasturiy ta'minot muhandisligi kafedralarida olib borilayotgan ta'lim, ilmiy va ma'naviy-ma'rifiy ishlar holati va uni yanada takomillashtirish choralari to'g'risida</w:t>
             </w:r>
           </w:p>
         </w:tc>
@@ -3942,7 +3888,17 @@
                 <w:rFonts w:ascii="Times New Roman" w:hAnsi="Times New Roman"/>
                 <w:lang w:val="uz-Latn-UZ"/>
               </w:rPr>
-              <w:t xml:space="preserve">Heads of Department </w:t>
+              <w:t xml:space="preserve">Kafedra mudirlari </w:t>
+              <w:br/>
+              <w:t xml:space="preserve">Sh. Yuldashev, </w:t>
+              <w:br/>
+              <w:t xml:space="preserve">O.A. Jo'rayev </w:t>
+              <w:br/>
+              <w:t xml:space="preserve"> </w:t>
+              <w:br/>
+              <w:t xml:space="preserve">O'quv-uslubiy kengash raisi </w:t>
+              <w:br/>
+              <w:t>K. Eshnazarov</w:t>
             </w:r>
           </w:p>
           <w:p>
@@ -4148,7 +4104,7 @@
                 <w:rFonts w:ascii="Times New Roman" w:hAnsi="Times New Roman"/>
                 <w:lang w:val="uz-Latn-UZ"/>
               </w:rPr>
-              <w:t>On increasing the social activity of student youth at the faculty, work within the framework of the five key initiatives, and the meaningful organization of young people's leisure time</w:t>
+              <w:t>Fakultetda talaba yoshlarning ijtimoiy faolligini oshirish, beshta muhim tashabbuslar doirasidagi ish va yoshlarning bo'sh vaqtini mazmunli tashkil etish to'g'risida</w:t>
             </w:r>
           </w:p>
         </w:tc>
@@ -4176,7 +4132,7 @@
                 <w:rFonts w:ascii="Times New Roman" w:hAnsi="Times New Roman"/>
                 <w:lang w:val="uz-Latn-UZ"/>
               </w:rPr>
-              <w:t>Leader of the Faculty Youth Union</w:t>
+              <w:t>Fakultet Yoshlar ittifoqi yetakchisi</w:t>
             </w:r>
           </w:p>
         </w:tc>
@@ -4204,7 +4160,7 @@
                 <w:rFonts w:ascii="Times New Roman" w:hAnsi="Times New Roman"/>
                 <w:lang w:val="uz-Latn-UZ"/>
               </w:rPr>
-              <w:t>Leader of the Faculty Youth Union</w:t>
+              <w:t>Fakultet Yoshlar ittifoqi yetakchisi</w:t>
             </w:r>
           </w:p>
         </w:tc>
@@ -4232,7 +4188,7 @@
                 <w:rFonts w:ascii="Times New Roman" w:hAnsi="Times New Roman"/>
                 <w:lang w:val="uz-Latn-UZ"/>
               </w:rPr>
-              <w:t>Leader of the Faculty Youth Union</w:t>
+              <w:t>Fakultet Yoshlar ittifoqi yetakchisi</w:t>
             </w:r>
           </w:p>
         </w:tc>
@@ -4290,7 +4246,7 @@
                 <w:rFonts w:ascii="Times New Roman" w:hAnsi="Times New Roman"/>
                 <w:lang w:val="uz-Latn-UZ"/>
               </w:rPr>
-              <w:t xml:space="preserve">Miscellaneous matters</w:t>
+              <w:t>Turli masalalar</w:t>
             </w:r>
           </w:p>
         </w:tc>
@@ -4317,7 +4273,7 @@
                 <w:rFonts w:ascii="Times New Roman" w:hAnsi="Times New Roman"/>
                 <w:lang w:val="uz-Latn-UZ"/>
               </w:rPr>
-              <w:t>Dean of the Faculty</w:t>
+              <w:t>Fakultet dekani</w:t>
             </w:r>
           </w:p>
         </w:tc>
@@ -4429,7 +4385,7 @@
                 <w:szCs w:val="28"/>
                 <w:lang w:val="uz-Latn-UZ"/>
               </w:rPr>
-              <w:t xml:space="preserve">Fourth Meeting – November 2025</w:t>
+              <w:t>To'rtinchi yig'ilish – 2025-yil noyabr</w:t>
             </w:r>
           </w:p>
         </w:tc>
@@ -4487,7 +4443,7 @@
                 <w:rFonts w:ascii="Times New Roman" w:hAnsi="Times New Roman"/>
                 <w:lang w:val="uz-Latn-UZ"/>
               </w:rPr>
-              <w:t xml:space="preserve">On the implementation at the faculty of the decrees of the President of the Republic of Uzbekistan, and the resolutions of the Cabinet of Ministers, the Ministry of Higher Education, Science and Innovation, and orders of the Rector of the University </w:t>
+              <w:t>O'zbekiston Respublikasi Prezidentining farmonlari, Vazirlar Mahkamasi, Oliy ta'lim, fan va innovatsiyalar vazirligi qarorlari va Universitet rektori buyruqlarining fakultetda bajarilishi to'g'risida</w:t>
             </w:r>
           </w:p>
         </w:tc>
@@ -4532,7 +4488,7 @@
                 <w:rFonts w:ascii="Times New Roman" w:hAnsi="Times New Roman"/>
                 <w:lang w:val="uz-Latn-UZ"/>
               </w:rPr>
-              <w:t>Dean of the Faculty</w:t>
+              <w:t>Fakultet dekani</w:t>
             </w:r>
           </w:p>
         </w:tc>
@@ -4680,7 +4636,7 @@
                 <w:rFonts w:ascii="Times New Roman" w:hAnsi="Times New Roman"/>
                 <w:lang w:val="uz-Latn-UZ"/>
               </w:rPr>
-              <w:t xml:space="preserve">On the status of fulfillment of the tasks set out in the target indicator strategy of the Faculty of Information Technologies for the 2025–2026 academic years</w:t>
+              <w:t>2025–2026 o'quv yillari uchun Axborot texnologiyalari fakulteti maqsadli ko'rsatkichlar strategiyasida belgilangan vazifalarning bajarilish holati to'g'risida</w:t>
             </w:r>
           </w:p>
         </w:tc>
@@ -4707,7 +4663,7 @@
                 <w:rFonts w:ascii="Times New Roman" w:hAnsi="Times New Roman"/>
                 <w:lang w:val="uz-Latn-UZ"/>
               </w:rPr>
-              <w:t xml:space="preserve">Head of Department </w:t>
+              <w:t>Kafedra mudiri</w:t>
             </w:r>
           </w:p>
           <w:p>
@@ -4743,7 +4699,7 @@
                 <w:rFonts w:ascii="Times New Roman" w:hAnsi="Times New Roman"/>
                 <w:lang w:val="uz-Latn-UZ"/>
               </w:rPr>
-              <w:t xml:space="preserve">Head of Department </w:t>
+              <w:t>Kafedra mudiri</w:t>
             </w:r>
           </w:p>
           <w:p>
@@ -4779,7 +4735,7 @@
                 <w:rFonts w:ascii="Times New Roman" w:hAnsi="Times New Roman"/>
                 <w:lang w:val="uz-Latn-UZ"/>
               </w:rPr>
-              <w:t xml:space="preserve">Head of Department </w:t>
+              <w:t>Kafedra mudiri</w:t>
             </w:r>
           </w:p>
           <w:p>
@@ -4847,7 +4803,7 @@
                 <w:rFonts w:ascii="Times New Roman" w:hAnsi="Times New Roman"/>
                 <w:lang w:val="uz-Latn-UZ"/>
               </w:rPr>
-              <w:t>On the state of educational and moral-ethical work at the faculty and measures for its further improvement</w:t>
+              <w:t>Fakultetdagi ta'lim va axloqiy-tarbiyaviy ishlar holati va uni yanada takomillashtirish choralari to'g'risida</w:t>
             </w:r>
           </w:p>
         </w:tc>
@@ -4875,7 +4831,7 @@
                 <w:rFonts w:ascii="Times New Roman" w:hAnsi="Times New Roman"/>
                 <w:lang w:val="uz-Latn-UZ"/>
               </w:rPr>
-              <w:t xml:space="preserve">Deputy Dean for Youth Affairs and Spiritual-Educational Work</w:t>
+              <w:t>Yoshlar ishlari va ma'naviy-ma'rifiy ish bo'yicha dekan o'rinbosari</w:t>
             </w:r>
           </w:p>
         </w:tc>
@@ -4989,7 +4945,7 @@
                 <w:rFonts w:ascii="Times New Roman" w:hAnsi="Times New Roman"/>
                 <w:lang w:val="uz-Latn-UZ"/>
               </w:rPr>
-              <w:t>Interim analysis of student academic performance and attendance: performance indicators by course, academic arrears, absenteeism, and the effectiveness of work with underperforming students</w:t>
+              <w:t>Talabalar o'zlashtirishining oraliq tahlili va davomat: kurslar bo'yicha o'zlashtirish ko'rsatkichlari, akademik qarzlar, darsga kelmaslik va past o'zlashtiruvchi talabalar bilan ishlash samaradorligi</w:t>
             </w:r>
           </w:p>
         </w:tc>
@@ -5016,7 +4972,7 @@
                 <w:rFonts w:ascii="Times New Roman" w:hAnsi="Times New Roman"/>
                 <w:lang w:val="uz-Latn-UZ"/>
               </w:rPr>
-              <w:t>Registrar's Office Manager assigned to the Faculty</w:t>
+              <w:t>Fakultetga biriktirilgan ro'yxatga olish bo'limi boshqaruvchisi</w:t>
             </w:r>
           </w:p>
         </w:tc>
@@ -5128,7 +5084,7 @@
                 <w:rFonts w:ascii="Times New Roman" w:hAnsi="Times New Roman"/>
                 <w:lang w:val="uz-Latn-UZ"/>
               </w:rPr>
-              <w:t xml:space="preserve">On the state of scientific work at the faculty for the 2026/2027 academic year and forthcoming tasks</w:t>
+              <w:t>2026/2027 o'quv yili uchun fakultetdagi ilmiy ish holati va kelgusi vazifalar to'g'risida</w:t>
             </w:r>
           </w:p>
         </w:tc>
@@ -5155,7 +5111,7 @@
                 <w:rFonts w:ascii="Times New Roman" w:hAnsi="Times New Roman"/>
                 <w:lang w:val="uz-Latn-UZ"/>
               </w:rPr>
-              <w:t xml:space="preserve">Head of Department </w:t>
+              <w:t>Kafedra mudiri</w:t>
             </w:r>
           </w:p>
           <w:p>
@@ -5191,7 +5147,7 @@
                 <w:rFonts w:ascii="Times New Roman" w:hAnsi="Times New Roman"/>
                 <w:lang w:val="uz-Latn-UZ"/>
               </w:rPr>
-              <w:t xml:space="preserve">Head of Department </w:t>
+              <w:t>Kafedra mudiri</w:t>
             </w:r>
           </w:p>
           <w:p>
@@ -5227,7 +5183,7 @@
                 <w:rFonts w:ascii="Times New Roman" w:hAnsi="Times New Roman"/>
                 <w:lang w:val="uz-Latn-UZ"/>
               </w:rPr>
-              <w:t xml:space="preserve">Head of Department </w:t>
+              <w:t>Kafedra mudiri</w:t>
             </w:r>
           </w:p>
           <w:p>
@@ -5294,7 +5250,7 @@
                 <w:rFonts w:ascii="Times New Roman" w:hAnsi="Times New Roman"/>
                 <w:lang w:val="uz-Latn-UZ"/>
               </w:rPr>
-              <w:t xml:space="preserve">On the state of educational, scientific, and spiritual-educational work conducted at the Department of Applied Mathematics and measures for its further improvement</w:t>
+              <w:t>Amaliy matematika kafedrasida olib borilayotgan ta'lim, ilmiy va ma'naviy-ma'rifiy ishlar holati va uni yanada takomillashtirish choralari to'g'risida</w:t>
             </w:r>
           </w:p>
         </w:tc>
@@ -5321,7 +5277,15 @@
                 <w:rFonts w:ascii="Times New Roman" w:hAnsi="Times New Roman"/>
                 <w:lang w:val="uz-Latn-UZ"/>
               </w:rPr>
-              <w:t xml:space="preserve">Head of Department </w:t>
+              <w:t xml:space="preserve">Kafedra mudiri </w:t>
+              <w:br/>
+              <w:t xml:space="preserve">K.A. G'ulomqodirov </w:t>
+              <w:br/>
+              <w:t xml:space="preserve"> </w:t>
+              <w:br/>
+              <w:t xml:space="preserve">O'quv-uslubiy kengash raisi </w:t>
+              <w:br/>
+              <w:t>K. Eshnazarov</w:t>
             </w:r>
           </w:p>
           <w:p>
@@ -5491,7 +5455,7 @@
                 <w:rFonts w:ascii="Times New Roman" w:hAnsi="Times New Roman"/>
                 <w:lang w:val="uz-Latn-UZ"/>
               </w:rPr>
-              <w:t>On executive discipline</w:t>
+              <w:t>Ijro intizomi to'g'risida</w:t>
             </w:r>
           </w:p>
         </w:tc>
@@ -5518,7 +5482,7 @@
                 <w:rFonts w:ascii="Times New Roman" w:hAnsi="Times New Roman"/>
                 <w:lang w:val="uz-Latn-UZ"/>
               </w:rPr>
-              <w:t xml:space="preserve">Deputy Dean for Youth Affairs and Spiritual-Educational Work</w:t>
+              <w:t>Yoshlar ishlari va ma'naviy-ma'rifiy ish bo'yicha dekan o'rinbosari</w:t>
             </w:r>
           </w:p>
         </w:tc>
@@ -5630,7 +5594,7 @@
                 <w:rFonts w:ascii="Times New Roman" w:hAnsi="Times New Roman"/>
                 <w:lang w:val="uz-Latn-UZ"/>
               </w:rPr>
-              <w:t xml:space="preserve">Miscellaneous matters</w:t>
+              <w:t>Turli masalalar</w:t>
             </w:r>
           </w:p>
         </w:tc>
@@ -5727,7 +5691,7 @@
                 <w:szCs w:val="28"/>
                 <w:lang w:val="uz-Latn-UZ"/>
               </w:rPr>
-              <w:t xml:space="preserve">Fifth Meeting – December 2025</w:t>
+              <w:t>Beshinchi yig'ilish – 2025-yil dekabr</w:t>
             </w:r>
           </w:p>
         </w:tc>
@@ -5787,7 +5751,7 @@
                 <w:szCs w:val="28"/>
                 <w:lang w:val="uz-Latn-UZ"/>
               </w:rPr>
-              <w:t>On ensuring the implementation of the orders of the Ministry of Higher Education, Science and Innovation of the Republic of Uzbekistan and of the Rector of Termez State University.</w:t>
+              <w:t>O'zbekiston Respublikasi Oliy ta'lim, fan va innovatsiyalar vazirligi va Termiz davlat universiteti rektori buyruqlarining bajarilishini ta'minlash to'g'risida.</w:t>
             </w:r>
           </w:p>
         </w:tc>
@@ -5817,7 +5781,7 @@
                 <w:szCs w:val="28"/>
                 <w:lang w:val="uz-Latn-UZ" w:eastAsia="uz-Cyrl-UZ"/>
               </w:rPr>
-              <w:t>Dean of the Faculty</w:t>
+              <w:t>Fakultet dekani</w:t>
             </w:r>
           </w:p>
         </w:tc>
@@ -5940,7 +5904,7 @@
                 <w:szCs w:val="28"/>
                 <w:lang w:val="uz-Latn-UZ"/>
               </w:rPr>
-              <w:t>On the progress of cooperation activities between departments and general education schools</w:t>
+              <w:t>Kafedralar va umumta'lim maktablari o'rtasidagi hamkorlik faoliyati borishi to'g'risida</w:t>
             </w:r>
           </w:p>
         </w:tc>
@@ -5970,7 +5934,7 @@
                 <w:szCs w:val="28"/>
                 <w:lang w:val="uz-Latn-UZ" w:eastAsia="uz-Cyrl-UZ"/>
               </w:rPr>
-              <w:t>Heads of Departments.</w:t>
+              <w:t>Kafedra mudirlari.</w:t>
             </w:r>
           </w:p>
         </w:tc>
@@ -6000,7 +5964,7 @@
                 <w:szCs w:val="28"/>
                 <w:lang w:val="uz-Latn-UZ" w:eastAsia="uz-Cyrl-UZ"/>
               </w:rPr>
-              <w:t>Heads of Departments.</w:t>
+              <w:t>Kafedra mudirlari.</w:t>
             </w:r>
           </w:p>
         </w:tc>
@@ -6030,7 +5994,7 @@
                 <w:szCs w:val="28"/>
                 <w:lang w:val="uz-Latn-UZ" w:eastAsia="uz-Cyrl-UZ"/>
               </w:rPr>
-              <w:t>Heads of Departments.</w:t>
+              <w:t>Kafedra mudirlari.</w:t>
             </w:r>
           </w:p>
         </w:tc>
@@ -6090,7 +6054,7 @@
                 <w:szCs w:val="28"/>
                 <w:lang w:val="uz-Latn-UZ"/>
               </w:rPr>
-              <w:t>Analysis of tutor activity at the faculty</w:t>
+              <w:t>Fakultetdagi tyutor faoliyatini tahlil qilish</w:t>
             </w:r>
           </w:p>
         </w:tc>
@@ -6119,7 +6083,7 @@
                 <w:szCs w:val="28"/>
                 <w:lang w:val="uz-Latn-UZ"/>
               </w:rPr>
-              <w:t>Chairperson of the Faculty Mentors' Council</w:t>
+              <w:t>Fakultet murabbiylar kengashi raisi</w:t>
             </w:r>
           </w:p>
           <w:p>
@@ -6159,7 +6123,7 @@
                 <w:szCs w:val="28"/>
                 <w:lang w:val="uz-Latn-UZ"/>
               </w:rPr>
-              <w:t>Chairperson of the Faculty Mentors' Council</w:t>
+              <w:t>Fakultet murabbiylar kengashi raisi</w:t>
             </w:r>
           </w:p>
         </w:tc>
@@ -6188,7 +6152,7 @@
                 <w:szCs w:val="28"/>
                 <w:lang w:val="uz-Latn-UZ"/>
               </w:rPr>
-              <w:t>Chairperson of the Faculty Mentors' Council</w:t>
+              <w:t>Fakultet murabbiylar kengashi raisi</w:t>
             </w:r>
           </w:p>
         </w:tc>
@@ -6257,7 +6221,7 @@
                 <w:szCs w:val="28"/>
                 <w:lang w:val="uz-Latn-UZ"/>
               </w:rPr>
-              <w:t xml:space="preserve">On the analysis of living conditions of students residing in dormitories, private housing, and rented accommodation, and the work being carried out regarding their social protection.</w:t>
+              <w:t>Yotoqxonalarda, xususiy turar joylarda va ijaraga olingan turar joylarda yashovchi talabalarning yashash sharoitlarini tahlil qilish va ularning ijtimoiy himoyasi bo'yicha olib borilayotgan ishlar to'g'risida.</w:t>
             </w:r>
           </w:p>
         </w:tc>
@@ -6287,7 +6251,7 @@
                 <w:rFonts w:ascii="Times New Roman" w:hAnsi="Times New Roman"/>
                 <w:lang w:val="uz-Latn-UZ"/>
               </w:rPr>
-              <w:t xml:space="preserve">Deputy Dean for Youth Affairs and Spiritual-Educational Work</w:t>
+              <w:t>Yoshlar ishlari va ma'naviy-ma'rifiy ish bo'yicha dekan o'rinbosari</w:t>
             </w:r>
           </w:p>
         </w:tc>
@@ -6405,7 +6369,7 @@
                 <w:szCs w:val="28"/>
                 <w:lang w:val="uz-Latn-UZ"/>
               </w:rPr>
-              <w:t>Miscellaneous matters</w:t>
+              <w:t>Turli masalalar</w:t>
             </w:r>
           </w:p>
         </w:tc>
@@ -6435,7 +6399,7 @@
                 <w:szCs w:val="28"/>
                 <w:lang w:val="uz-Latn-UZ"/>
               </w:rPr>
-              <w:t>Dean of the Faculty</w:t>
+              <w:t>Fakultet dekani</w:t>
             </w:r>
           </w:p>
         </w:tc>
@@ -6465,7 +6429,7 @@
                 <w:szCs w:val="28"/>
                 <w:lang w:val="uz-Latn-UZ"/>
               </w:rPr>
-              <w:t>Dean of the Faculty</w:t>
+              <w:t>Fakultet dekani</w:t>
             </w:r>
           </w:p>
         </w:tc>
@@ -6495,7 +6459,7 @@
                 <w:szCs w:val="28"/>
                 <w:lang w:val="uz-Latn-UZ"/>
               </w:rPr>
-              <w:t>Dean of the Faculty</w:t>
+              <w:t>Fakultet dekani</w:t>
             </w:r>
           </w:p>
         </w:tc>
@@ -6532,7 +6496,7 @@
                 <w:szCs w:val="28"/>
                 <w:lang w:val="uz-Latn-UZ"/>
               </w:rPr>
-              <w:t xml:space="preserve">Sixth Meeting – January 2026</w:t>
+              <w:t>Oltinchi yig'ilish – 2026-yil yanvar</w:t>
             </w:r>
           </w:p>
         </w:tc>
@@ -6592,7 +6556,7 @@
                 <w:szCs w:val="28"/>
                 <w:lang w:val="uz-Latn-UZ"/>
               </w:rPr>
-              <w:t>On ensuring the implementation of the orders of the Ministry of Higher Education, Science and Innovation of the Republic of Uzbekistan and of the Rector of Termez State University.</w:t>
+              <w:t>O'zbekiston Respublikasi Oliy ta'lim, fan va innovatsiyalar vazirligi va Termiz davlat universiteti rektori buyruqlarining bajarilishini ta'minlash to'g'risida.</w:t>
             </w:r>
           </w:p>
         </w:tc>
@@ -6624,7 +6588,7 @@
                 <w:szCs w:val="28"/>
                 <w:lang w:val="uz-Latn-UZ"/>
               </w:rPr>
-              <w:t>Dean of the Faculty</w:t>
+              <w:t>Fakultet dekani</w:t>
             </w:r>
           </w:p>
         </w:tc>
@@ -6753,7 +6717,7 @@
                 <w:szCs w:val="28"/>
                 <w:lang w:val="uz-Latn-UZ"/>
               </w:rPr>
-              <w:t>On the procedure for introducing the credit-module system into the educational process, and the content and requirements of the relevant Regulation and the HEMIS program.</w:t>
+              <w:t>Kredit-modul tizimini o'quv jarayoniga joriy etish tartibi hamda tegishli Nizom va HEMIS dasturining mazmuni va talablari to'g'risida.</w:t>
             </w:r>
           </w:p>
         </w:tc>
@@ -6782,7 +6746,7 @@
                 <w:rFonts w:ascii="Times New Roman" w:hAnsi="Times New Roman"/>
                 <w:lang w:val="uz-Latn-UZ"/>
               </w:rPr>
-              <w:t>Registrar's Office Manager assigned to the Faculty</w:t>
+              <w:t>Fakultetga biriktirilgan ro'yxatga olish bo'limi boshqaruvchisi</w:t>
             </w:r>
           </w:p>
         </w:tc>
@@ -6909,7 +6873,7 @@
                 <w:szCs w:val="28"/>
                 <w:lang w:val="uz-Latn-UZ"/>
               </w:rPr>
-              <w:t>On forming a database of course literature and electronic resources for courses</w:t>
+              <w:t>Fan adabiyotlari va elektron resurslar bazasini shakllantirish to'g'risida.</w:t>
             </w:r>
             <w:r>
               <w:rPr>
@@ -6918,7 +6882,6 @@
                 <w:szCs w:val="28"/>
                 <w:lang w:val="uz-Latn-UZ"/>
               </w:rPr>
-              <w:t xml:space="preserve"/>
             </w:r>
             <w:r>
               <w:rPr>
@@ -6926,7 +6889,6 @@
                 <w:szCs w:val="28"/>
                 <w:lang w:val="uz-Latn-UZ"/>
               </w:rPr>
-              <w:t>.</w:t>
             </w:r>
           </w:p>
         </w:tc>
@@ -6957,7 +6919,7 @@
                 <w:szCs w:val="28"/>
                 <w:lang w:val="uz-Latn-UZ" w:eastAsia="uz-Cyrl-UZ"/>
               </w:rPr>
-              <w:t>Heads of Departments.</w:t>
+              <w:t>Kafedra mudirlari.</w:t>
             </w:r>
           </w:p>
           <w:p>
@@ -6999,7 +6961,7 @@
                 <w:szCs w:val="28"/>
                 <w:lang w:val="uz-Latn-UZ" w:eastAsia="uz-Cyrl-UZ"/>
               </w:rPr>
-              <w:t>Heads of Departments.</w:t>
+              <w:t>Kafedra mudirlari.</w:t>
             </w:r>
           </w:p>
         </w:tc>
@@ -7030,7 +6992,7 @@
                 <w:szCs w:val="28"/>
                 <w:lang w:val="uz-Latn-UZ" w:eastAsia="uz-Cyrl-UZ"/>
               </w:rPr>
-              <w:t>Department Information Officers.</w:t>
+              <w:t>Kafedra axborot xodimlari.</w:t>
             </w:r>
           </w:p>
         </w:tc>
@@ -7091,7 +7053,7 @@
                 <w:szCs w:val="28"/>
                 <w:lang w:val="uz-Latn-UZ"/>
               </w:rPr>
-              <w:t>On further improving work with youth and the spiritual-educational sphere at the faculty</w:t>
+              <w:t>Fakultetda yoshlar va ma'naviy-ma'rifiy soha bilan ishlashni yanada takomillashtirish to'g'risida</w:t>
             </w:r>
           </w:p>
         </w:tc>
@@ -7120,7 +7082,7 @@
                 <w:rFonts w:ascii="Times New Roman" w:hAnsi="Times New Roman"/>
                 <w:lang w:val="uz-Latn-UZ"/>
               </w:rPr>
-              <w:t xml:space="preserve">Deputy Dean for Youth Affairs and Spiritual-Educational Work</w:t>
+              <w:t>Yoshlar ishlari va ma'naviy-ma'rifiy ish bo'yicha dekan o'rinbosari</w:t>
             </w:r>
           </w:p>
         </w:tc>
@@ -7238,7 +7200,7 @@
                 <w:szCs w:val="28"/>
                 <w:lang w:val="uz-Latn-UZ"/>
               </w:rPr>
-              <w:t>Miscellaneous matters.</w:t>
+              <w:t>Turli masalalar.</w:t>
             </w:r>
           </w:p>
         </w:tc>
@@ -7269,7 +7231,7 @@
                 <w:szCs w:val="28"/>
                 <w:lang w:val="uz-Latn-UZ"/>
               </w:rPr>
-              <w:t>Dean of the Faculty</w:t>
+              <w:t>Fakultet dekani</w:t>
             </w:r>
           </w:p>
         </w:tc>
@@ -7368,7 +7330,7 @@
                 <w:szCs w:val="28"/>
                 <w:lang w:val="uz-Latn-UZ"/>
               </w:rPr>
-              <w:t xml:space="preserve">Seventh Meeting – February 2026</w:t>
+              <w:t>Yettinchi yig'ilish – 2026-yil fevral</w:t>
             </w:r>
           </w:p>
         </w:tc>
@@ -7428,7 +7390,7 @@
                 <w:szCs w:val="28"/>
                 <w:lang w:val="uz-Latn-UZ"/>
               </w:rPr>
-              <w:t>On ensuring the implementation of the orders of the Ministry of Higher Education, Science and Innovation of the Republic of Uzbekistan and of the Rector of Termez State University.</w:t>
+              <w:t>O'zbekiston Respublikasi Oliy ta'lim, fan va innovatsiyalar vazirligi va Termiz davlat universiteti rektori buyruqlarining bajarilishini ta'minlash to'g'risida.</w:t>
             </w:r>
           </w:p>
         </w:tc>
@@ -7459,7 +7421,7 @@
                 <w:szCs w:val="28"/>
                 <w:lang w:val="uz-Latn-UZ"/>
               </w:rPr>
-              <w:t>Dean of the Faculty</w:t>
+              <w:t>Fakultet dekani</w:t>
             </w:r>
           </w:p>
         </w:tc>
@@ -7587,7 +7549,7 @@
                 <w:szCs w:val="28"/>
                 <w:lang w:val="uz-Latn-UZ"/>
               </w:rPr>
-              <w:t>On introducing innovative methods for planning, organizing, and ensuring the quality of educational processes based on the credit system.</w:t>
+              <w:t>Kredit tizimi asosida o'quv jarayonlarini rejalashtirish, tashkil etish va sifatini ta'minlashning innovatsion usullarini joriy etish to'g'risida.</w:t>
             </w:r>
           </w:p>
         </w:tc>
@@ -7621,7 +7583,7 @@
               <w:rPr>
                 <w:lang w:val="uz-Latn-UZ"/>
               </w:rPr>
-              <w:t>Registrar's Office Manager assigned to the Faculty</w:t>
+              <w:t>Fakultetga biriktirilgan ro'yxatga olish bo'limi boshqaruvchisi</w:t>
             </w:r>
           </w:p>
         </w:tc>
@@ -7745,7 +7707,7 @@
                 <w:szCs w:val="28"/>
                 <w:lang w:val="uz-Latn-UZ"/>
               </w:rPr>
-              <w:t>On the organization of qualification internships within the credit education system, and on the progress of preparation for pedagogical practice for</w:t>
+              <w:t>Kredit ta'lim tizimida malaka amaliyotini tashkil etish va bitiruvchi talabalar uchun pedagogik amaliyotga tayyorgarlik borishi to'g'risida</w:t>
             </w:r>
             <w:r>
               <w:rPr>
@@ -7754,7 +7716,6 @@
                 <w:szCs w:val="28"/>
                 <w:lang w:val="uz-Latn-UZ" w:eastAsia="uz-Cyrl-UZ"/>
               </w:rPr>
-              <w:t xml:space="preserve"> graduating students</w:t>
             </w:r>
           </w:p>
         </w:tc>
@@ -7785,7 +7746,7 @@
                 <w:szCs w:val="28"/>
                 <w:lang w:val="uz-Latn-UZ" w:eastAsia="uz-Cyrl-UZ"/>
               </w:rPr>
-              <w:t>Heads of Departments</w:t>
+              <w:t>Kafedra mudirlari</w:t>
             </w:r>
           </w:p>
           <w:p>
@@ -7827,7 +7788,7 @@
                 <w:szCs w:val="28"/>
                 <w:lang w:val="uz-Latn-UZ" w:eastAsia="uz-Cyrl-UZ"/>
               </w:rPr>
-              <w:t>Heads of Departments</w:t>
+              <w:t>Kafedra mudirlari</w:t>
             </w:r>
           </w:p>
         </w:tc>
@@ -7858,7 +7819,7 @@
                 <w:szCs w:val="28"/>
                 <w:lang w:val="uz-Latn-UZ" w:eastAsia="uz-Cyrl-UZ"/>
               </w:rPr>
-              <w:t>Department Information Officers.</w:t>
+              <w:t>Kafedra axborot xodimlari.</w:t>
             </w:r>
           </w:p>
         </w:tc>
@@ -7918,7 +7879,7 @@
                 <w:szCs w:val="28"/>
                 <w:lang w:val="uz-Latn-UZ"/>
               </w:rPr>
-              <w:t>On forming a specialized group with an enhanced program for gifted students at the faculty</w:t>
+              <w:t>Fakultetdagi iste'dodli talabalar uchun kuchaytirilgan dasturli ixtisoslashtirilgan guruh tashkil etish to'g'risida</w:t>
             </w:r>
           </w:p>
         </w:tc>
@@ -7947,7 +7908,7 @@
                 <w:rFonts w:ascii="Times New Roman" w:hAnsi="Times New Roman"/>
                 <w:lang w:val="uz-Latn-UZ"/>
               </w:rPr>
-              <w:t>Registrar's Office Manager assigned to the Faculty</w:t>
+              <w:t>Fakultetga biriktirilgan ro'yxatga olish bo'limi boshqaruvchisi</w:t>
             </w:r>
           </w:p>
         </w:tc>
@@ -8069,7 +8030,7 @@
                 <w:szCs w:val="28"/>
                 <w:lang w:val="uz-Latn-UZ"/>
               </w:rPr>
-              <w:t>Miscellaneous matters.</w:t>
+              <w:t>Turli masalalar.</w:t>
             </w:r>
           </w:p>
         </w:tc>
@@ -8100,7 +8061,7 @@
                 <w:szCs w:val="28"/>
                 <w:lang w:val="uz-Latn-UZ"/>
               </w:rPr>
-              <w:t>Dean of the Faculty</w:t>
+              <w:t>Fakultet dekani</w:t>
             </w:r>
           </w:p>
         </w:tc>
@@ -8199,7 +8160,7 @@
                 <w:szCs w:val="28"/>
                 <w:lang w:val="uz-Latn-UZ"/>
               </w:rPr>
-              <w:t xml:space="preserve">Eighth Meeting – March 2026</w:t>
+              <w:t>Sakkizinchi yig'ilish – 2026-yil mart</w:t>
             </w:r>
           </w:p>
         </w:tc>
@@ -8259,7 +8220,7 @@
                 <w:szCs w:val="28"/>
                 <w:lang w:val="uz-Latn-UZ"/>
               </w:rPr>
-              <w:t>On ensuring the implementation of the orders of the Ministry of Higher Education, Science and Innovation of the Republic of Uzbekistan and of the Rector of Termez State University.</w:t>
+              <w:t>O'zbekiston Respublikasi Oliy ta'lim, fan va innovatsiyalar vazirligi va Termiz davlat universiteti rektori buyruqlarining bajarilishini ta'minlash to'g'risida.</w:t>
             </w:r>
           </w:p>
         </w:tc>
@@ -8290,7 +8251,7 @@
                 <w:szCs w:val="28"/>
                 <w:lang w:val="uz-Latn-UZ"/>
               </w:rPr>
-              <w:t>Dean of the Faculty</w:t>
+              <w:t>Fakultet dekani</w:t>
             </w:r>
           </w:p>
         </w:tc>
@@ -8418,7 +8379,7 @@
                 <w:szCs w:val="28"/>
                 <w:lang w:val="uz-Latn-UZ"/>
               </w:rPr>
-              <w:t>On the current status and prospective tasks regarding the organization of the educational process, the quality and effectiveness of education, the training of competitive personnel, and the publication of articles in prestigious scientific journals.</w:t>
+              <w:t>O'quv jarayonini tashkil etish, ta'lim sifati va samaradorligi, raqobatbardosh kadrlar tayyorlash va nufuzli ilmiy jurnallarda maqolalar chop etish bo'yicha hozirgi holat va istiqbolli vazifalar to'g'risida.</w:t>
             </w:r>
           </w:p>
         </w:tc>
@@ -8448,7 +8409,7 @@
                 <w:szCs w:val="28"/>
                 <w:lang w:val="uz-Latn-UZ" w:eastAsia="uz-Cyrl-UZ"/>
               </w:rPr>
-              <w:t>Deputy Dean for Scientific Affairs</w:t>
+              <w:t>Ilmiy ishlar bo'yicha dekan o'rinbosari</w:t>
             </w:r>
           </w:p>
         </w:tc>
@@ -8479,7 +8440,7 @@
                 <w:szCs w:val="28"/>
                 <w:lang w:val="uz-Latn-UZ" w:eastAsia="uz-Cyrl-UZ"/>
               </w:rPr>
-              <w:t>Deputy Dean for Scientific Affairs</w:t>
+              <w:t>Ilmiy ishlar bo'yicha dekan o'rinbosari</w:t>
             </w:r>
           </w:p>
           <w:p>
@@ -8520,7 +8481,7 @@
                 <w:szCs w:val="28"/>
                 <w:lang w:val="uz-Latn-UZ" w:eastAsia="uz-Cyrl-UZ"/>
               </w:rPr>
-              <w:t>Deputy Dean for Scientific Affairs</w:t>
+              <w:t>Ilmiy ishlar bo'yicha dekan o'rinbosari</w:t>
             </w:r>
           </w:p>
         </w:tc>
@@ -8586,7 +8547,7 @@
                 <w:szCs w:val="28"/>
                 <w:lang w:val="uz-Latn-UZ"/>
               </w:rPr>
-              <w:t>On forming a database of course literature and electronic resources by educational program and specialization, and on the status of their placement in the Automated Workplace (ARM) system</w:t>
+              <w:t>Ta'lim dasturi va ixtisoslik bo'yicha fan adabiyotlari va elektron resurslar bazasini shakllantirish hamda ularni Avtomatlashtirilgan ish joyi (AIJ) tizimiga joylashtirish holati to'g'risida (2026-yil yanvar yig'ilishida berilgan vazifalar bajarilishining tahlili).</w:t>
             </w:r>
             <w:r>
               <w:rPr>
@@ -8595,7 +8556,6 @@
                 <w:szCs w:val="28"/>
                 <w:lang w:val="uz-Latn-UZ"/>
               </w:rPr>
-              <w:t xml:space="preserve"> (analysis of the implementation of tasks assigned at the January 2026 meeting).</w:t>
             </w:r>
           </w:p>
         </w:tc>
@@ -8626,7 +8586,7 @@
                 <w:szCs w:val="28"/>
                 <w:lang w:val="uz-Latn-UZ" w:eastAsia="uz-Cyrl-UZ"/>
               </w:rPr>
-              <w:t>Heads of Departments</w:t>
+              <w:t>Kafedra mudirlari</w:t>
             </w:r>
           </w:p>
           <w:p>
@@ -8690,7 +8650,7 @@
                 <w:szCs w:val="28"/>
                 <w:lang w:val="uz-Latn-UZ" w:eastAsia="uz-Cyrl-UZ"/>
               </w:rPr>
-              <w:t>Heads of Departments</w:t>
+              <w:t>Kafedra mudirlari</w:t>
             </w:r>
           </w:p>
         </w:tc>
@@ -8721,7 +8681,7 @@
                 <w:szCs w:val="28"/>
                 <w:lang w:val="uz-Latn-UZ" w:eastAsia="uz-Cyrl-UZ"/>
               </w:rPr>
-              <w:t>Department Information Officers.</w:t>
+              <w:t>Kafedra axborot xodimlari.</w:t>
             </w:r>
           </w:p>
         </w:tc>
@@ -8787,7 +8747,7 @@
                 <w:szCs w:val="28"/>
                 <w:lang w:val="uz-Latn-UZ"/>
               </w:rPr>
-              <w:t>On ensuring the meaningful use of students' leisure time and their engagement in employment</w:t>
+              <w:t>Talabalarning bo'sh vaqtini mazmunli o'tkazish va ularni ish bilan ta'minlashni ta'minlash to'g'risida</w:t>
             </w:r>
           </w:p>
         </w:tc>
@@ -8816,7 +8776,7 @@
                 <w:rFonts w:ascii="Times New Roman" w:hAnsi="Times New Roman"/>
                 <w:lang w:val="uz-Latn-UZ"/>
               </w:rPr>
-              <w:t xml:space="preserve">Deputy Dean for Youth Affairs and Spiritual-Educational Work</w:t>
+              <w:t>Yoshlar ishlari va ma'naviy-ma'rifiy ish bo'yicha dekan o'rinbosari</w:t>
             </w:r>
           </w:p>
         </w:tc>
@@ -8934,7 +8894,7 @@
                 <w:szCs w:val="28"/>
                 <w:lang w:val="uz-Latn-UZ"/>
               </w:rPr>
-              <w:t>Miscellaneous matters.</w:t>
+              <w:t>Turli masalalar.</w:t>
             </w:r>
           </w:p>
         </w:tc>
@@ -8965,7 +8925,7 @@
                 <w:szCs w:val="28"/>
                 <w:lang w:val="uz-Latn-UZ"/>
               </w:rPr>
-              <w:t>Dean of the Faculty</w:t>
+              <w:t>Fakultet dekani</w:t>
             </w:r>
           </w:p>
         </w:tc>
@@ -9068,7 +9028,7 @@
                 <w:szCs w:val="28"/>
                 <w:lang w:val="uz-Latn-UZ"/>
               </w:rPr>
-              <w:t xml:space="preserve">Ninth Meeting – April 2026</w:t>
+              <w:t>To'qqizinchi yig'ilish – 2026-yil aprel</w:t>
             </w:r>
           </w:p>
           <w:p>
@@ -9139,7 +9099,7 @@
                 <w:szCs w:val="28"/>
                 <w:lang w:val="uz-Latn-UZ"/>
               </w:rPr>
-              <w:t>On ensuring the implementation of the orders of the Ministry of Higher Education, Science and Innovation of the Republic of Uzbekistan and of the Rector of Termez State University.</w:t>
+              <w:t>O'zbekiston Respublikasi Oliy ta'lim, fan va innovatsiyalar vazirligi va Termiz davlat universiteti rektori buyruqlarining bajarilishini ta'minlash to'g'risida.</w:t>
             </w:r>
           </w:p>
         </w:tc>
@@ -9170,7 +9130,7 @@
                 <w:szCs w:val="28"/>
                 <w:lang w:val="uz-Latn-UZ"/>
               </w:rPr>
-              <w:t>Dean of the Faculty</w:t>
+              <w:t>Fakultet dekani</w:t>
             </w:r>
           </w:p>
         </w:tc>
@@ -9293,7 +9253,7 @@
                 <w:szCs w:val="28"/>
                 <w:lang w:val="uz-Latn-UZ" w:eastAsia="uz-Cyrl-UZ"/>
               </w:rPr>
-              <w:t xml:space="preserve">On the progress of state attestation for final-year bachelor's students and the readiness of master's students for the defense of their master's theses.</w:t>
+              <w:t>Bitiruvchi bakalavriat talabalarining davlat attestatsiyasi borishi va magistrantlarning magistrlik dissertatsiyasi himoyasiga tayyorgarlik holati to'g'risida.</w:t>
             </w:r>
           </w:p>
         </w:tc>
@@ -9324,7 +9284,7 @@
                 <w:szCs w:val="28"/>
                 <w:lang w:val="uz-Latn-UZ"/>
               </w:rPr>
-              <w:t>Dean of the Faculty</w:t>
+              <w:t>Fakultet dekani</w:t>
             </w:r>
           </w:p>
         </w:tc>
@@ -9447,7 +9407,7 @@
                 <w:szCs w:val="28"/>
                 <w:lang w:val="uz-Latn-UZ"/>
               </w:rPr>
-              <w:t>Measures for enhancing the scientific potential of departments' faculty members.</w:t>
+              <w:t>Kafedralar professor-o'qituvchilarining ilmiy salohiyatini oshirish choralari.</w:t>
             </w:r>
           </w:p>
         </w:tc>
@@ -9477,7 +9437,7 @@
                 <w:szCs w:val="28"/>
                 <w:lang w:val="uz-Latn-UZ" w:eastAsia="uz-Cyrl-UZ"/>
               </w:rPr>
-              <w:t>Deputy Dean for Scientific Affairs</w:t>
+              <w:t>Ilmiy ishlar bo'yicha dekan o'rinbosari</w:t>
             </w:r>
           </w:p>
         </w:tc>
@@ -9508,7 +9468,7 @@
                 <w:szCs w:val="28"/>
                 <w:lang w:val="uz-Latn-UZ" w:eastAsia="uz-Cyrl-UZ"/>
               </w:rPr>
-              <w:t>Deputy Dean for Scientific Affairs</w:t>
+              <w:t>Ilmiy ishlar bo'yicha dekan o'rinbosari</w:t>
             </w:r>
           </w:p>
         </w:tc>
@@ -9538,7 +9498,7 @@
                 <w:szCs w:val="28"/>
                 <w:lang w:val="uz-Latn-UZ" w:eastAsia="uz-Cyrl-UZ"/>
               </w:rPr>
-              <w:t>Deputy Dean for Scientific Affairs</w:t>
+              <w:t>Ilmiy ishlar bo'yicha dekan o'rinbosari</w:t>
             </w:r>
           </w:p>
         </w:tc>
@@ -9605,7 +9565,7 @@
                 <w:szCs w:val="28"/>
                 <w:lang w:val="uz-Latn-UZ" w:eastAsia="uz-Cyrl-UZ"/>
               </w:rPr>
-              <w:t xml:space="preserve">On the progress of the activity of subject-based clubs at the faculty.</w:t>
+              <w:t>Fakultetdagi fan to'garaklari faoliyati borishi to'g'risida.</w:t>
             </w:r>
           </w:p>
           <w:p>
@@ -9652,7 +9612,7 @@
                 <w:szCs w:val="28"/>
                 <w:lang w:val="uz-Latn-UZ" w:eastAsia="uz-Cyrl-UZ"/>
               </w:rPr>
-              <w:t>Heads of Departments</w:t>
+              <w:t>Kafedra mudirlari</w:t>
             </w:r>
           </w:p>
           <w:p>
@@ -9693,7 +9653,7 @@
                 <w:szCs w:val="28"/>
                 <w:lang w:val="uz-Latn-UZ" w:eastAsia="uz-Cyrl-UZ"/>
               </w:rPr>
-              <w:t>Heads of Departments</w:t>
+              <w:t>Kafedra mudirlari</w:t>
             </w:r>
           </w:p>
         </w:tc>
@@ -9724,7 +9684,7 @@
                 <w:szCs w:val="28"/>
                 <w:lang w:val="uz-Latn-UZ" w:eastAsia="uz-Cyrl-UZ"/>
               </w:rPr>
-              <w:t>Department Information Officers.</w:t>
+              <w:t>Kafedra axborot xodimlari.</w:t>
             </w:r>
           </w:p>
         </w:tc>
@@ -9776,7 +9736,7 @@
                 <w:szCs w:val="28"/>
                 <w:lang w:val="uz-Latn-UZ"/>
               </w:rPr>
-              <w:t xml:space="preserve">On improving the activity of faculty members under the new</w:t>
+              <w:t>Kredit ta'lim tizimini joriy etishning yangi sharoitlarida professor-o'qituvchilar faoliyatini takomillashtirish to'g'risida</w:t>
             </w:r>
           </w:p>
           <w:p>
@@ -9831,7 +9791,7 @@
                 <w:szCs w:val="28"/>
                 <w:lang w:val="uz-Latn-UZ"/>
               </w:rPr>
-              <w:t>Dean of the Faculty</w:t>
+              <w:t>Fakultet dekani</w:t>
             </w:r>
           </w:p>
         </w:tc>
@@ -9953,7 +9913,7 @@
                 <w:szCs w:val="28"/>
                 <w:lang w:val="uz-Latn-UZ"/>
               </w:rPr>
-              <w:t>Miscellaneous matters.</w:t>
+              <w:t>Turli masalalar.</w:t>
             </w:r>
           </w:p>
         </w:tc>
@@ -9984,7 +9944,7 @@
                 <w:szCs w:val="28"/>
                 <w:lang w:val="uz-Latn-UZ"/>
               </w:rPr>
-              <w:t>Dean of the Faculty</w:t>
+              <w:t>Fakultet dekani</w:t>
             </w:r>
           </w:p>
         </w:tc>
@@ -10084,7 +10044,7 @@
                 <w:szCs w:val="28"/>
                 <w:lang w:val="uz-Latn-UZ"/>
               </w:rPr>
-              <w:t xml:space="preserve">Tenth Meeting – May 2026</w:t>
+              <w:t>O'ninchi yig'ilish – 2026-yil may</w:t>
             </w:r>
           </w:p>
           <w:p>
@@ -10157,7 +10117,7 @@
                 <w:szCs w:val="28"/>
                 <w:lang w:val="uz-Latn-UZ"/>
               </w:rPr>
-              <w:t>On ensuring the implementation of the orders of the Ministry of Higher Education, Science and Innovation of the Republic of Uzbekistan and of the Rector of Termez State University.</w:t>
+              <w:t>O'zbekiston Respublikasi Oliy ta'lim, fan va innovatsiyalar vazirligi va Termiz davlat universiteti rektori buyruqlarining bajarilishini ta'minlash to'g'risida.</w:t>
             </w:r>
           </w:p>
         </w:tc>
@@ -10188,7 +10148,7 @@
                 <w:szCs w:val="28"/>
                 <w:lang w:val="uz-Latn-UZ"/>
               </w:rPr>
-              <w:t>Dean of the Faculty</w:t>
+              <w:t>Fakultet dekani</w:t>
             </w:r>
           </w:p>
         </w:tc>
@@ -10311,7 +10271,7 @@
                 <w:szCs w:val="28"/>
                 <w:lang w:val="uz-Latn-UZ" w:eastAsia="uz-Cyrl-UZ"/>
               </w:rPr>
-              <w:t>On the state attestation of final-year bachelor's students and the defense of master's theses</w:t>
+              <w:t>Bitiruvchi bakalavriat talabalarining davlat attestatsiyasi va magistrantlarning magistrlik dissertatsiyasi himoyasi to'g'risida</w:t>
             </w:r>
           </w:p>
         </w:tc>
@@ -10342,7 +10302,7 @@
                 <w:szCs w:val="28"/>
                 <w:lang w:val="uz-Latn-UZ"/>
               </w:rPr>
-              <w:t>Dean of the Faculty</w:t>
+              <w:t>Fakultet dekani</w:t>
             </w:r>
           </w:p>
         </w:tc>
@@ -10466,7 +10426,7 @@
                 <w:szCs w:val="28"/>
                 <w:lang w:val="uz-Latn-UZ" w:eastAsia="uz-Cyrl-UZ"/>
               </w:rPr>
-              <w:t>Annual report on the activity of the Deputy Dean for Youth Affairs and Spiritual-Educational Work.</w:t>
+              <w:t>Yoshlar ishlari va ma'naviy-ma'rifiy ish bo'yicha dekan o'rinbosarining yillik hisoboti.</w:t>
             </w:r>
           </w:p>
           <w:p>
@@ -10505,7 +10465,7 @@
                 <w:rFonts w:ascii="Times New Roman" w:hAnsi="Times New Roman"/>
                 <w:lang w:val="uz-Latn-UZ"/>
               </w:rPr>
-              <w:t xml:space="preserve">Deputy Dean for Youth Affairs and Spiritual-Educational Work</w:t>
+              <w:t>Yoshlar ishlari va ma'naviy-ma'rifiy ish bo'yicha dekan o'rinbosari</w:t>
             </w:r>
           </w:p>
         </w:tc>
@@ -10624,7 +10584,7 @@
                 <w:szCs w:val="28"/>
                 <w:lang w:val="uz-Latn-UZ" w:eastAsia="uz-Cyrl-UZ"/>
               </w:rPr>
-              <w:t xml:space="preserve">On the state of employment of graduating students.</w:t>
+              <w:t>Bitiruvchi talabalarning ish bilan ta'minlanish holati to'g'risida.</w:t>
             </w:r>
           </w:p>
         </w:tc>
@@ -10655,7 +10615,7 @@
                 <w:szCs w:val="28"/>
                 <w:lang w:val="uz-Latn-UZ" w:eastAsia="uz-Cyrl-UZ"/>
               </w:rPr>
-              <w:t>Heads of Departments.</w:t>
+              <w:t>Kafedra mudirlari.</w:t>
             </w:r>
           </w:p>
           <w:p>
@@ -10697,7 +10657,7 @@
                 <w:szCs w:val="28"/>
                 <w:lang w:val="uz-Latn-UZ" w:eastAsia="uz-Cyrl-UZ"/>
               </w:rPr>
-              <w:t>Heads of Departments.</w:t>
+              <w:t>Kafedra mudirlari.</w:t>
             </w:r>
           </w:p>
         </w:tc>
@@ -10728,7 +10688,7 @@
                 <w:szCs w:val="28"/>
                 <w:lang w:val="uz-Latn-UZ" w:eastAsia="uz-Cyrl-UZ"/>
               </w:rPr>
-              <w:t>Department Information Officers.</w:t>
+              <w:t>Kafedra axborot xodimlari.</w:t>
             </w:r>
           </w:p>
         </w:tc>
@@ -10788,7 +10748,7 @@
                 <w:szCs w:val="28"/>
                 <w:lang w:val="uz-Latn-UZ"/>
               </w:rPr>
-              <w:t>Miscellaneous matters.</w:t>
+              <w:t>Turli masalalar.</w:t>
             </w:r>
           </w:p>
         </w:tc>
@@ -10819,7 +10779,7 @@
                 <w:szCs w:val="28"/>
                 <w:lang w:val="uz-Latn-UZ"/>
               </w:rPr>
-              <w:t>Dean of the Faculty</w:t>
+              <w:t>Fakultet dekani</w:t>
             </w:r>
           </w:p>
         </w:tc>
@@ -10918,7 +10878,7 @@
                 <w:szCs w:val="28"/>
                 <w:lang w:val="uz-Latn-UZ"/>
               </w:rPr>
-              <w:t xml:space="preserve">Eleventh Meeting – June 2026</w:t>
+              <w:t>O'n birinchi yig'ilish – 2026-yil iyun</w:t>
             </w:r>
           </w:p>
         </w:tc>
@@ -10978,7 +10938,7 @@
                 <w:szCs w:val="28"/>
                 <w:lang w:val="uz-Latn-UZ"/>
               </w:rPr>
-              <w:t>On ensuring the implementation of the orders of the Ministry of Higher Education, Science and Innovation of the Republic of Uzbekistan and of the Rector of Termez State University.</w:t>
+              <w:t>O'zbekiston Respublikasi Oliy ta'lim, fan va innovatsiyalar vazirligi va Termiz davlat universiteti rektori buyruqlarining bajarilishini ta'minlash to'g'risida.</w:t>
             </w:r>
           </w:p>
         </w:tc>
@@ -11009,7 +10969,7 @@
                 <w:szCs w:val="28"/>
                 <w:lang w:val="uz-Latn-UZ"/>
               </w:rPr>
-              <w:t>Dean of the Faculty</w:t>
+              <w:t>Fakultet dekani</w:t>
             </w:r>
           </w:p>
         </w:tc>
@@ -11131,7 +11091,7 @@
                 <w:szCs w:val="28"/>
                 <w:lang w:val="uz-Latn-UZ"/>
               </w:rPr>
-              <w:t xml:space="preserve">Annual report of the Faculty Council on the 2025-2026 academic year.</w:t>
+              <w:t>Fakultet kengashining 2025-2026 o'quv yili bo'yicha yillik hisoboti.</w:t>
             </w:r>
           </w:p>
         </w:tc>
@@ -11162,7 +11122,7 @@
                 <w:szCs w:val="28"/>
                 <w:lang w:val="uz-Latn-UZ"/>
               </w:rPr>
-              <w:t>Dean of the Faculty</w:t>
+              <w:t>Fakultet dekani</w:t>
             </w:r>
           </w:p>
         </w:tc>
@@ -11285,7 +11245,7 @@
                 <w:szCs w:val="28"/>
                 <w:lang w:val="uz-Latn-UZ"/>
               </w:rPr>
-              <w:t>Report of heads of departments on the fulfillment of the academic year's teaching load and the status of preparation for the new academic year.</w:t>
+              <w:t>Kafedra mudirlarining o'quv yili o'quv yuklamasining bajarilishi va yangi o'quv yiliga tayyorgarlik holati to'g'risidagi hisoboti.</w:t>
             </w:r>
           </w:p>
         </w:tc>
@@ -11316,7 +11276,7 @@
                 <w:szCs w:val="28"/>
                 <w:lang w:val="uz-Latn-UZ" w:eastAsia="uz-Cyrl-UZ"/>
               </w:rPr>
-              <w:t>Heads of Departments</w:t>
+              <w:t>Kafedra mudirlari</w:t>
             </w:r>
           </w:p>
           <w:p>
@@ -11358,7 +11318,7 @@
                 <w:szCs w:val="28"/>
                 <w:lang w:val="uz-Latn-UZ" w:eastAsia="uz-Cyrl-UZ"/>
               </w:rPr>
-              <w:t>Heads of Departments</w:t>
+              <w:t>Kafedra mudirlari</w:t>
             </w:r>
           </w:p>
         </w:tc>
@@ -11389,7 +11349,7 @@
                 <w:szCs w:val="28"/>
                 <w:lang w:val="uz-Latn-UZ" w:eastAsia="uz-Cyrl-UZ"/>
               </w:rPr>
-              <w:t>Department Information Officers.</w:t>
+              <w:t>Kafedra axborot xodimlari.</w:t>
             </w:r>
           </w:p>
         </w:tc>
@@ -11456,7 +11416,7 @@
                 <w:szCs w:val="28"/>
                 <w:lang w:val="uz-Latn-UZ" w:eastAsia="uz-Cyrl-UZ"/>
               </w:rPr>
-              <w:t xml:space="preserve">Annual report on the activity of the Faculty Women's Committee.</w:t>
+              <w:t>Fakultet xotin-qizlar qo'mitasi faoliyatining yillik hisoboti.</w:t>
             </w:r>
           </w:p>
           <w:p>
@@ -11496,7 +11456,7 @@
                 <w:szCs w:val="28"/>
                 <w:lang w:val="uz-Latn-UZ" w:eastAsia="uz-Cyrl-UZ"/>
               </w:rPr>
-              <w:t xml:space="preserve">Chairperson of the Faculty Women's Committee.</w:t>
+              <w:t>Fakultet xotin-qizlar qo'mitasi raisi.</w:t>
             </w:r>
           </w:p>
         </w:tc>
@@ -11526,7 +11486,7 @@
                 <w:szCs w:val="28"/>
                 <w:lang w:val="uz-Latn-UZ" w:eastAsia="uz-Cyrl-UZ"/>
               </w:rPr>
-              <w:t xml:space="preserve">Chairperson of the Faculty Women's Committee.</w:t>
+              <w:t>Fakultet xotin-qizlar qo'mitasi raisi.</w:t>
             </w:r>
           </w:p>
         </w:tc>
@@ -11556,7 +11516,7 @@
                 <w:szCs w:val="28"/>
                 <w:lang w:val="uz-Latn-UZ" w:eastAsia="uz-Cyrl-UZ"/>
               </w:rPr>
-              <w:t xml:space="preserve">Chairperson of the Faculty Women's Committee.</w:t>
+              <w:t>Fakultet xotin-qizlar qo'mitasi raisi.</w:t>
             </w:r>
           </w:p>
         </w:tc>
@@ -11616,7 +11576,7 @@
                 <w:szCs w:val="28"/>
                 <w:lang w:val="uz-Latn-UZ"/>
               </w:rPr>
-              <w:t xml:space="preserve">Annual report on the activity of the Leader of the Primary Organization of the Youth Union of Uzbekistan, Faculty of Information Technologies, Termez State University</w:t>
+              <w:t>Termiz davlat universiteti Axborot texnologiyalari fakulteti O'zbekiston Yoshlar ittifoqi boshlang'ich tashkiloti yetakchisi faoliyatining yillik hisoboti.</w:t>
             </w:r>
             <w:r>
               <w:rPr>
@@ -11625,7 +11585,6 @@
                 <w:szCs w:val="28"/>
                 <w:lang w:val="uz-Latn-UZ" w:eastAsia="uz-Cyrl-UZ"/>
               </w:rPr>
-              <w:t xml:space="preserve">.</w:t>
             </w:r>
           </w:p>
         </w:tc>
@@ -11654,7 +11613,7 @@
                 <w:szCs w:val="28"/>
                 <w:lang w:val="uz-Latn-UZ"/>
               </w:rPr>
-              <w:t xml:space="preserve">Leader of the Primary Organization of the Youth Union of Uzbekistan, Faculty of Information Technologies, Termez State University</w:t>
+              <w:t>Termiz davlat universiteti Axborot texnologiyalari fakulteti O'zbekiston Yoshlar ittifoqi boshlang'ich tashkiloti yetakchisi, Rais.</w:t>
             </w:r>
             <w:r>
               <w:rPr>
@@ -11663,7 +11622,6 @@
                 <w:szCs w:val="28"/>
                 <w:lang w:val="uz-Latn-UZ" w:eastAsia="uz-Cyrl-UZ"/>
               </w:rPr>
-              <w:t xml:space="preserve">, Chairperson.</w:t>
             </w:r>
           </w:p>
         </w:tc>
@@ -11692,7 +11650,7 @@
                 <w:szCs w:val="28"/>
                 <w:lang w:val="uz-Latn-UZ"/>
               </w:rPr>
-              <w:t xml:space="preserve">Leader of the Primary Organization of the Youth Union of Uzbekistan, Faculty of Information Technologies, Termez State University</w:t>
+              <w:t>Termiz davlat universiteti Axborot texnologiyalari fakulteti O'zbekiston Yoshlar ittifoqi boshlang'ich tashkiloti yetakchisi, Rais.</w:t>
             </w:r>
             <w:r>
               <w:rPr>
@@ -11701,7 +11659,6 @@
                 <w:szCs w:val="28"/>
                 <w:lang w:val="uz-Latn-UZ" w:eastAsia="uz-Cyrl-UZ"/>
               </w:rPr>
-              <w:t xml:space="preserve">, Chairperson.</w:t>
             </w:r>
           </w:p>
         </w:tc>
@@ -11730,7 +11687,7 @@
                 <w:szCs w:val="28"/>
                 <w:lang w:val="uz-Latn-UZ"/>
               </w:rPr>
-              <w:t xml:space="preserve">Leader of the Primary Organization of the Youth Union of Uzbekistan, Faculty of Information Technologies, Termez State University</w:t>
+              <w:t>Termiz davlat universiteti Axborot texnologiyalari fakulteti O'zbekiston Yoshlar ittifoqi boshlang'ich tashkiloti yetakchisi, Rais.</w:t>
             </w:r>
             <w:r>
               <w:rPr>
@@ -11739,7 +11696,6 @@
                 <w:szCs w:val="28"/>
                 <w:lang w:val="uz-Latn-UZ" w:eastAsia="uz-Cyrl-UZ"/>
               </w:rPr>
-              <w:t xml:space="preserve">, Chairperson.</w:t>
             </w:r>
           </w:p>
         </w:tc>
@@ -11804,7 +11760,7 @@
                 <w:szCs w:val="28"/>
                 <w:lang w:val="uz-Latn-UZ"/>
               </w:rPr>
-              <w:t>Miscellaneous matters</w:t>
+              <w:t>Turli masalalar</w:t>
             </w:r>
           </w:p>
         </w:tc>
@@ -11835,7 +11791,7 @@
                 <w:szCs w:val="28"/>
                 <w:lang w:val="uz-Latn-UZ"/>
               </w:rPr>
-              <w:t>Dean of the Faculty</w:t>
+              <w:t>Fakultet dekani</w:t>
             </w:r>
           </w:p>
         </w:tc>
@@ -11934,7 +11890,7 @@
           <w:szCs w:val="28"/>
           <w:lang w:val="uz-Latn-UZ"/>
         </w:rPr>
-        <w:t xml:space="preserve">Note: — </w:t>
+        <w:t>Izoh: — O'quv yili davomida O'zbekiston Respublikasi Prezidentining farmonlari, alohida masalalar bo'yicha qarorlar va buyruqlar, Oliy ta'lim, fan va innovatsiyalar vazirligi buyruqlari hamda Vazirlik Hay'ati qarorlari Fakultet kengashi kun tartibiga asosiy yoki bosh masala sifatida kiritilishi mumkin.</w:t>
       </w:r>
       <w:r>
         <w:rPr>
@@ -11943,7 +11899,6 @@
           <w:szCs w:val="28"/>
           <w:lang w:val="uz-Latn-UZ"/>
         </w:rPr>
-        <w:t>During the a</w:t>
       </w:r>
       <w:r>
         <w:rPr>
@@ -11951,7 +11906,6 @@
           <w:szCs w:val="28"/>
           <w:lang w:val="uz-Latn-UZ"/>
         </w:rPr>
-        <w:t xml:space="preserve">cademic year, decrees of the President of the Republic of Uzbekistan, resolutions and orders on particular matters, orders of the Ministry of Higher Education, Science and Innovation, and resolutions of the Ministry's Board may be included in the agenda of the Faculty Council as a principal or main item.</w:t>
       </w:r>
     </w:p>
     <w:p>
@@ -11972,7 +11926,7 @@
           <w:szCs w:val="28"/>
           <w:lang w:val="uz-Latn-UZ"/>
         </w:rPr>
-        <w:t xml:space="preserve">     </w:t>
+        <w:t xml:space="preserve">     — ish rejasining kengaytirilgan kun tartibi bir o'quv yili davomida ilmiy ma'ruzalar 2 (4) marta tinglanishini ham nazarda tutadi.</w:t>
       </w:r>
       <w:r>
         <w:rPr>
@@ -11982,7 +11936,6 @@
           <w:szCs w:val="28"/>
           <w:lang w:val="uz-Latn-UZ"/>
         </w:rPr>
-        <w:t xml:space="preserve">— </w:t>
       </w:r>
       <w:r>
         <w:rPr>
@@ -11990,7 +11943,6 @@
           <w:szCs w:val="28"/>
           <w:lang w:val="uz-Latn-UZ"/>
         </w:rPr>
-        <w:t xml:space="preserve">the expanded agenda of the work plan also envisages that scientific reports be heard 2 (4) times during one academic year.</w:t>
       </w:r>
     </w:p>
     <w:p>
@@ -12015,7 +11967,7 @@
           <w:szCs w:val="28"/>
           <w:lang w:val="uz-Latn-UZ"/>
         </w:rPr>
-        <w:t xml:space="preserve">During the academic year:</w:t>
+        <w:t>O'quv yili davomida:</w:t>
       </w:r>
     </w:p>
     <w:p>
@@ -12039,7 +11991,7 @@
           <w:szCs w:val="28"/>
           <w:lang w:val="uz-Latn-UZ"/>
         </w:rPr>
-        <w:t xml:space="preserve">Familiarizing members of the Academic Council with the decrees of the President of the Republic of Uzbekistan, government resolutions and instructions on education, and the orders and Board resolutions of the Ministry of Higher Education, Science and Innovation, and reviewing their implementation.</w:t>
+        <w:t>Ilmiy kengash a'zolarini O'zbekiston Respublikasi Prezidentining ta'lim bo'yicha farmonlari, hukumat qarorlari va ko'rsatmalari hamda Oliy ta'lim, fan va innovatsiyalar vazirligi buyruqlari va Hay'at qarorlari bilan tanishtirish va ularning bajarilishini ko'rib chiqish.</w:t>
       </w:r>
     </w:p>
     <w:p>
@@ -12063,7 +12015,7 @@
           <w:szCs w:val="28"/>
           <w:lang w:val="uz-Latn-UZ"/>
         </w:rPr>
-        <w:t xml:space="preserve">Submission to the Higher Attestation Commission for the academic titles of Professor and Associate Professor, as well as for the titles of "Honorary Doctor of TerSU," "University Professor," and "University Associate Professor."</w:t>
+        <w:t>Professor va dotsent ilmiy unvonlari, shuningdek "TerDU faxriy doktori", "Universitet professori" va "Universitet dotsenti" unvonlari uchun Oliy attestatsiya komissiyasiga taqdim etish.</w:t>
       </w:r>
     </w:p>
     <w:p>
@@ -12087,7 +12039,7 @@
           <w:szCs w:val="28"/>
           <w:lang w:val="uz-Latn-UZ"/>
         </w:rPr>
-        <w:t xml:space="preserve">Recommendation for the positions of Head of Department and Department Professor.</w:t>
+        <w:t>Kafedra mudiri va kafedra professori lavozimlariga tavsiya berish.</w:t>
       </w:r>
     </w:p>
     <w:p>
@@ -12111,7 +12063,7 @@
           <w:szCs w:val="28"/>
           <w:lang w:val="uz-Latn-UZ"/>
         </w:rPr>
-        <w:t xml:space="preserve">Recommendation for granting creative leave for work on doctoral dissertations and for the preparation of textbooks and study guides.</w:t>
+        <w:t>Doktorlik dissertatsiyasi ustida ishlash hamda darslik va o'quv qo'llanmalar tayyorlash uchun ijodiy ta'til berish bo'yicha tavsiya berish.</w:t>
       </w:r>
     </w:p>
     <w:p>
@@ -12135,7 +12087,7 @@
           <w:szCs w:val="28"/>
           <w:lang w:val="uz-Latn-UZ"/>
         </w:rPr>
-        <w:t xml:space="preserve">Recommendation to the Coordinating Council for the approval of textbooks and study guides prepared by faculty members.</w:t>
+        <w:t>Professor-o'qituvchilar tomonidan tayyorlangan darslik va o'quv qo'llanmalarni tasdiqlash uchun Muvofiqlashtiruvchi kengashga tavsiya berish.</w:t>
       </w:r>
     </w:p>
     <w:p>
@@ -12159,7 +12111,7 @@
           <w:szCs w:val="28"/>
           <w:lang w:val="uz-Latn-UZ"/>
         </w:rPr>
-        <w:t xml:space="preserve">Recommendation for the publication of monographs, methodological guides, and other educational-methodological works prepared by faculty members.</w:t>
+        <w:t>Professor-o'qituvchilar tomonidan tayyorlangan monografiyalar, uslubiy qo'llanmalar va boshqa o'quv-uslubiy ishlarni nashr etish uchun tavsiya berish.</w:t>
       </w:r>
     </w:p>
     <w:p>
@@ -12183,7 +12135,7 @@
           <w:szCs w:val="28"/>
           <w:lang w:val="uz-Latn-UZ"/>
         </w:rPr>
-        <w:t xml:space="preserve">Review of materials for submitting the works of faculty scholars for state awards and awards named after distinguished individuals.</w:t>
+        <w:t>Fakultet olimlarining ishlarini davlat mukofotlari va taniqli shaxslar nomidagi mukofotlarga taqdim etish uchun materiallarni ko'rib chiqish.</w:t>
       </w:r>
     </w:p>
     <w:p>
@@ -12207,7 +12159,7 @@
           <w:szCs w:val="28"/>
           <w:lang w:val="uz-Latn-UZ"/>
         </w:rPr>
-        <w:t xml:space="preserve">Review of candidacies of faculty scholars for full membership in the Academy of Sciences, and support for relevant decisions of other higher education institutions and research institutes in this field.</w:t>
+        <w:t>Fakultet olimlarini Fanlar akademiyasining to'la a'zoligiga nomzodligini ko'rib chiqish hamda boshqa oliy ta'lim muassasalari va ilmiy-tadqiqot institutlarining ushbu sohadagi tegishli qarorlarini qo'llab-quvvatlash.</w:t>
       </w:r>
     </w:p>
     <w:p>
@@ -12231,7 +12183,7 @@
           <w:szCs w:val="28"/>
           <w:lang w:val="uz-Latn-UZ"/>
         </w:rPr>
-        <w:t xml:space="preserve">Recommendation of gifted students, master's students, and basic doctoral candidates for the State Scholarship of the President of the Republic of Uzbekistan and named scholarships.</w:t>
+        <w:t>Iste'dodli talabalar, magistrantlar va tayanch doktorantlarni O'zbekiston Respublikasi Prezidentining Davlat stipendiyasi va nomli stipendiyalarga tavsiya berish.</w:t>
       </w:r>
     </w:p>
     <w:p>
@@ -12255,7 +12207,7 @@
           <w:szCs w:val="28"/>
           <w:lang w:val="uz-Latn-UZ"/>
         </w:rPr>
-        <w:t xml:space="preserve">Review of other matters arising from faculty activities that require a Council resolution.</w:t>
+        <w:t>Fakultet faoliyatidan kelib chiqadigan va Kengash qarori talab etiladigan boshqa masalalarni ko'rib chiqish.</w:t>
       </w:r>
     </w:p>
     <w:p>
@@ -12300,7 +12252,7 @@
           <w:szCs w:val="28"/>
           <w:lang w:val="uz-Latn-UZ"/>
         </w:rPr>
-        <w:t xml:space="preserve"> Council Chairperson:                                      </w:t>
+        <w:t xml:space="preserve"> Kengash raisi:                                      </w:t>
         <w:tab/>
         <w:tab/>
         <w:t xml:space="preserve">F.T. Djumayev </w:t>
@@ -12339,7 +12291,10 @@
           <w:szCs w:val="28"/>
           <w:lang w:val="uz-Latn-UZ"/>
         </w:rPr>
-        <w:t xml:space="preserve"> Council Secretary</w:t>
+        <w:t xml:space="preserve"> Kengash kotibi:                                  </w:t>
+        <w:tab/>
+        <w:tab/>
+        <w:t>B.P. Abdullayev</w:t>
       </w:r>
       <w:r>
         <w:rPr>
@@ -12350,9 +12305,6 @@
           <w:szCs w:val="28"/>
           <w:lang w:val="uz-Latn-UZ"/>
         </w:rPr>
-        <w:t xml:space="preserve">:                                  </w:t>
-        <w:tab/>
-        <w:tab/>
       </w:r>
       <w:r>
         <w:rPr>
@@ -12362,7 +12314,6 @@
           <w:szCs w:val="28"/>
           <w:lang w:val="uz-Latn-UZ"/>
         </w:rPr>
-        <w:t xml:space="preserve">B.P. Abdullayev</w:t>
       </w:r>
     </w:p>
     <w:p>
@@ -12476,7 +12427,7 @@
 </w:document>
 </file>
 
-<file path=word\endnotes.xml><?xml version="1.0" encoding="utf-8"?>
+<file path=word/endnotes.xml><?xml version="1.0" encoding="utf-8"?>
 <w:endnotes xmlns:wpc="http://schemas.microsoft.com/office/word/2010/wordprocessingCanvas" xmlns:cx="http://schemas.microsoft.com/office/drawing/2014/chartex" xmlns:cx1="http://schemas.microsoft.com/office/drawing/2015/9/8/chartex" xmlns:cx2="http://schemas.microsoft.com/office/drawing/2015/10/21/chartex" xmlns:cx3="http://schemas.microsoft.com/office/drawing/2016/5/9/chartex" xmlns:cx4="http://schemas.microsoft.com/office/drawing/2016/5/10/chartex" xmlns:cx5="http://schemas.microsoft.com/office/drawing/2016/5/11/chartex" xmlns:cx6="http://schemas.microsoft.com/office/drawing/2016/5/12/chartex" xmlns:cx7="http://schemas.microsoft.com/office/drawing/2016/5/13/chartex" xmlns:cx8="http://schemas.microsoft.com/office/drawing/2016/5/14/chartex" xmlns:mc="http://schemas.openxmlformats.org/markup-compatibility/2006" xmlns:aink="http://schemas.microsoft.com/office/drawing/2016/ink" xmlns:am3d="http://schemas.microsoft.com/office/drawing/2017/model3d" xmlns:o="urn:schemas-microsoft-com:office:office" xmlns:oel="http://schemas.microsoft.com/office/2019/extlst" xmlns:r="http://schemas.openxmlformats.org/officeDocument/2006/relationships" xmlns:m="http://schemas.openxmlformats.org/officeDocument/2006/math" xmlns:v="urn:schemas-microsoft-com:vml" xmlns:wp14="http://schemas.microsoft.com/office/word/2010/wordprocessingDrawing" xmlns:wp="http://schemas.openxmlformats.org/drawingml/2006/wordprocessingDrawing" xmlns:w10="urn:schemas-microsoft-com:office:word" xmlns:w="http://schemas.openxmlformats.org/wordprocessingml/2006/main" xmlns:w14="http://schemas.microsoft.com/office/word/2010/wordml" xmlns:w15="http://schemas.microsoft.com/office/word/2012/wordml" xmlns:w16cex="http://schemas.microsoft.com/office/word/2018/wordml/cex" xmlns:w16cid="http://schemas.microsoft.com/office/word/2016/wordml/cid" xmlns:w16="http://schemas.microsoft.com/office/word/2018/wordml" xmlns:w16sdtdh="http://schemas.microsoft.com/office/word/2020/wordml/sdtdatahash" xmlns:w16se="http://schemas.microsoft.com/office/word/2015/wordml/symex" xmlns:wpg="http://schemas.microsoft.com/office/word/2010/wordprocessingGroup" xmlns:wpi="http://schemas.microsoft.com/office/word/2010/wordprocessingInk" xmlns:wne="http://schemas.microsoft.com/office/word/2006/wordml" xmlns:wps="http://schemas.microsoft.com/office/word/2010/wordprocessingShape" mc:Ignorable="w14 w15 w16se w16cid w16 w16cex w16sdtdh wp14">
   <w:endnote w:type="separator" w:id="-1">
     <w:p>
@@ -12495,74 +12446,7 @@
 </w:endnotes>
 </file>
 
-<file path=word\fontTable.xml><?xml version="1.0" encoding="utf-8"?>
-<w:fonts xmlns:mc="http://schemas.openxmlformats.org/markup-compatibility/2006" xmlns:r="http://schemas.openxmlformats.org/officeDocument/2006/relationships" xmlns:w="http://schemas.openxmlformats.org/wordprocessingml/2006/main" xmlns:w14="http://schemas.microsoft.com/office/word/2010/wordml" xmlns:w15="http://schemas.microsoft.com/office/word/2012/wordml" xmlns:w16cex="http://schemas.microsoft.com/office/word/2018/wordml/cex" xmlns:w16cid="http://schemas.microsoft.com/office/word/2016/wordml/cid" xmlns:w16="http://schemas.microsoft.com/office/word/2018/wordml" xmlns:w16sdtdh="http://schemas.microsoft.com/office/word/2020/wordml/sdtdatahash" xmlns:w16se="http://schemas.microsoft.com/office/word/2015/wordml/symex" mc:Ignorable="w14 w15 w16se w16cid w16 w16cex w16sdtdh">
-  <w:font w:name="Times New Roman">
-    <w:panose1 w:val="02020603050405020304"/>
-    <w:charset w:val="00"/>
-    <w:family w:val="roman"/>
-    <w:pitch w:val="variable"/>
-    <w:sig w:usb0="E0002EFF" w:usb1="C000785B" w:usb2="00000009" w:usb3="00000000" w:csb0="000001FF" w:csb1="00000000"/>
-  </w:font>
-  <w:font w:name="Calibri">
-    <w:panose1 w:val="020F0502020204030204"/>
-    <w:charset w:val="00"/>
-    <w:family w:val="swiss"/>
-    <w:pitch w:val="variable"/>
-    <w:sig w:usb0="E4002EFF" w:usb1="C000247B" w:usb2="00000009" w:usb3="00000000" w:csb0="000001FF" w:csb1="00000000"/>
-  </w:font>
-  <w:font w:name="Bodo Baltica Uz">
-    <w:altName w:val="Malgun Gothic"/>
-    <w:charset w:val="00"/>
-    <w:family w:val="swiss"/>
-    <w:pitch w:val="default"/>
-    <w:sig w:usb0="00000000" w:usb1="00000000" w:usb2="00000000" w:usb3="00000000" w:csb0="00000005" w:csb1="00000000"/>
-  </w:font>
-  <w:font w:name="Bodo Lazurski Uz">
-    <w:altName w:val="Impact"/>
-    <w:charset w:val="00"/>
-    <w:family w:val="swiss"/>
-    <w:pitch w:val="variable"/>
-    <w:sig w:usb0="00000203" w:usb1="00000000" w:usb2="00000000" w:usb3="00000000" w:csb0="00000005" w:csb1="00000000"/>
-  </w:font>
-  <w:font w:name="Calibri Light">
-    <w:panose1 w:val="020F0302020204030204"/>
-    <w:charset w:val="00"/>
-    <w:family w:val="swiss"/>
-    <w:pitch w:val="variable"/>
-    <w:sig w:usb0="E4002EFF" w:usb1="C000247B" w:usb2="00000009" w:usb3="00000000" w:csb0="000001FF" w:csb1="00000000"/>
-  </w:font>
-  <w:font w:name="Segoe UI">
-    <w:panose1 w:val="020B0502040204020203"/>
-    <w:charset w:val="00"/>
-    <w:family w:val="swiss"/>
-    <w:pitch w:val="variable"/>
-    <w:sig w:usb0="E4002EFF" w:usb1="C000E47F" w:usb2="00000009" w:usb3="00000000" w:csb0="000001FF" w:csb1="00000000"/>
-  </w:font>
-  <w:font w:name="Batang">
-    <w:altName w:val="바탕"/>
-    <w:panose1 w:val="02030600000101010101"/>
-    <w:charset w:val="81"/>
-    <w:family w:val="roman"/>
-    <w:pitch w:val="variable"/>
-    <w:sig w:usb0="B00002AF" w:usb1="69D77CFB" w:usb2="00000030" w:usb3="00000000" w:csb0="0008009F" w:csb1="00000000"/>
-  </w:font>
-  <w:font w:name="Aptos Display">
-    <w:charset w:val="00"/>
-    <w:family w:val="swiss"/>
-    <w:pitch w:val="variable"/>
-    <w:sig w:usb0="20000287" w:usb1="00000003" w:usb2="00000000" w:usb3="00000000" w:csb0="0000019F" w:csb1="00000000"/>
-  </w:font>
-  <w:font w:name="Aptos">
-    <w:charset w:val="00"/>
-    <w:family w:val="swiss"/>
-    <w:pitch w:val="variable"/>
-    <w:sig w:usb0="20000287" w:usb1="00000003" w:usb2="00000000" w:usb3="00000000" w:csb0="0000019F" w:csb1="00000000"/>
-  </w:font>
-</w:fonts>
-</file>
-
-<file path=word\footnotes.xml><?xml version="1.0" encoding="utf-8"?>
+<file path=word/footnotes.xml><?xml version="1.0" encoding="utf-8"?>
 <w:footnotes xmlns:wpc="http://schemas.microsoft.com/office/word/2010/wordprocessingCanvas" xmlns:cx="http://schemas.microsoft.com/office/drawing/2014/chartex" xmlns:cx1="http://schemas.microsoft.com/office/drawing/2015/9/8/chartex" xmlns:cx2="http://schemas.microsoft.com/office/drawing/2015/10/21/chartex" xmlns:cx3="http://schemas.microsoft.com/office/drawing/2016/5/9/chartex" xmlns:cx4="http://schemas.microsoft.com/office/drawing/2016/5/10/chartex" xmlns:cx5="http://schemas.microsoft.com/office/drawing/2016/5/11/chartex" xmlns:cx6="http://schemas.microsoft.com/office/drawing/2016/5/12/chartex" xmlns:cx7="http://schemas.microsoft.com/office/drawing/2016/5/13/chartex" xmlns:cx8="http://schemas.microsoft.com/office/drawing/2016/5/14/chartex" xmlns:mc="http://schemas.openxmlformats.org/markup-compatibility/2006" xmlns:aink="http://schemas.microsoft.com/office/drawing/2016/ink" xmlns:am3d="http://schemas.microsoft.com/office/drawing/2017/model3d" xmlns:o="urn:schemas-microsoft-com:office:office" xmlns:oel="http://schemas.microsoft.com/office/2019/extlst" xmlns:r="http://schemas.openxmlformats.org/officeDocument/2006/relationships" xmlns:m="http://schemas.openxmlformats.org/officeDocument/2006/math" xmlns:v="urn:schemas-microsoft-com:vml" xmlns:wp14="http://schemas.microsoft.com/office/word/2010/wordprocessingDrawing" xmlns:wp="http://schemas.openxmlformats.org/drawingml/2006/wordprocessingDrawing" xmlns:w10="urn:schemas-microsoft-com:office:word" xmlns:w="http://schemas.openxmlformats.org/wordprocessingml/2006/main" xmlns:w14="http://schemas.microsoft.com/office/word/2010/wordml" xmlns:w15="http://schemas.microsoft.com/office/word/2012/wordml" xmlns:w16cex="http://schemas.microsoft.com/office/word/2018/wordml/cex" xmlns:w16cid="http://schemas.microsoft.com/office/word/2016/wordml/cid" xmlns:w16="http://schemas.microsoft.com/office/word/2018/wordml" xmlns:w16sdtdh="http://schemas.microsoft.com/office/word/2020/wordml/sdtdatahash" xmlns:w16se="http://schemas.microsoft.com/office/word/2015/wordml/symex" xmlns:wpg="http://schemas.microsoft.com/office/word/2010/wordprocessingGroup" xmlns:wpi="http://schemas.microsoft.com/office/word/2010/wordprocessingInk" xmlns:wne="http://schemas.microsoft.com/office/word/2006/wordml" xmlns:wps="http://schemas.microsoft.com/office/word/2010/wordprocessingShape" mc:Ignorable="w14 w15 w16se w16cid w16 w16cex w16sdtdh wp14">
   <w:footnote w:type="separator" w:id="-1">
     <w:p>
@@ -12581,7 +12465,7 @@
 </w:footnotes>
 </file>
 
-<file path=word\numbering.xml><?xml version="1.0" encoding="utf-8"?>
+<file path=word/numbering.xml><?xml version="1.0" encoding="utf-8"?>
 <w:numbering xmlns:wpc="http://schemas.microsoft.com/office/word/2010/wordprocessingCanvas" xmlns:cx="http://schemas.microsoft.com/office/drawing/2014/chartex" xmlns:cx1="http://schemas.microsoft.com/office/drawing/2015/9/8/chartex" xmlns:cx2="http://schemas.microsoft.com/office/drawing/2015/10/21/chartex" xmlns:cx3="http://schemas.microsoft.com/office/drawing/2016/5/9/chartex" xmlns:cx4="http://schemas.microsoft.com/office/drawing/2016/5/10/chartex" xmlns:cx5="http://schemas.microsoft.com/office/drawing/2016/5/11/chartex" xmlns:cx6="http://schemas.microsoft.com/office/drawing/2016/5/12/chartex" xmlns:cx7="http://schemas.microsoft.com/office/drawing/2016/5/13/chartex" xmlns:cx8="http://schemas.microsoft.com/office/drawing/2016/5/14/chartex" xmlns:mc="http://schemas.openxmlformats.org/markup-compatibility/2006" xmlns:aink="http://schemas.microsoft.com/office/drawing/2016/ink" xmlns:am3d="http://schemas.microsoft.com/office/drawing/2017/model3d" xmlns:o="urn:schemas-microsoft-com:office:office" xmlns:oel="http://schemas.microsoft.com/office/2019/extlst" xmlns:r="http://schemas.openxmlformats.org/officeDocument/2006/relationships" xmlns:m="http://schemas.openxmlformats.org/officeDocument/2006/math" xmlns:v="urn:schemas-microsoft-com:vml" xmlns:wp14="http://schemas.microsoft.com/office/word/2010/wordprocessingDrawing" xmlns:wp="http://schemas.openxmlformats.org/drawingml/2006/wordprocessingDrawing" xmlns:w10="urn:schemas-microsoft-com:office:word" xmlns:w="http://schemas.openxmlformats.org/wordprocessingml/2006/main" xmlns:w14="http://schemas.microsoft.com/office/word/2010/wordml" xmlns:w15="http://schemas.microsoft.com/office/word/2012/wordml" xmlns:w16cex="http://schemas.microsoft.com/office/word/2018/wordml/cex" xmlns:w16cid="http://schemas.microsoft.com/office/word/2016/wordml/cid" xmlns:w16="http://schemas.microsoft.com/office/word/2018/wordml" xmlns:w16sdtdh="http://schemas.microsoft.com/office/word/2020/wordml/sdtdatahash" xmlns:w16se="http://schemas.microsoft.com/office/word/2015/wordml/symex" xmlns:wpg="http://schemas.microsoft.com/office/word/2010/wordprocessingGroup" xmlns:wpi="http://schemas.microsoft.com/office/word/2010/wordprocessingInk" xmlns:wne="http://schemas.microsoft.com/office/word/2006/wordml" xmlns:wps="http://schemas.microsoft.com/office/word/2010/wordprocessingShape" mc:Ignorable="w14 w15 w16se w16cid w16 w16cex w16sdtdh wp14">
   <w:abstractNum w:abstractNumId="0" w15:restartNumberingAfterBreak="0">
     <w:nsid w:val="512D0195"/>
@@ -12798,347 +12682,7 @@
 </w:numbering>
 </file>
 
-<file path=word\settings.xml><?xml version="1.0" encoding="utf-8"?>
-<w:settings xmlns:mc="http://schemas.openxmlformats.org/markup-compatibility/2006" xmlns:o="urn:schemas-microsoft-com:office:office" xmlns:r="http://schemas.openxmlformats.org/officeDocument/2006/relationships" xmlns:m="http://schemas.openxmlformats.org/officeDocument/2006/math" xmlns:v="urn:schemas-microsoft-com:vml" xmlns:w10="urn:schemas-microsoft-com:office:word" xmlns:w="http://schemas.openxmlformats.org/wordprocessingml/2006/main" xmlns:w14="http://schemas.microsoft.com/office/word/2010/wordml" xmlns:w15="http://schemas.microsoft.com/office/word/2012/wordml" xmlns:w16cex="http://schemas.microsoft.com/office/word/2018/wordml/cex" xmlns:w16cid="http://schemas.microsoft.com/office/word/2016/wordml/cid" xmlns:w16="http://schemas.microsoft.com/office/word/2018/wordml" xmlns:w16sdtdh="http://schemas.microsoft.com/office/word/2020/wordml/sdtdatahash" xmlns:w16se="http://schemas.microsoft.com/office/word/2015/wordml/symex" xmlns:sl="http://schemas.openxmlformats.org/schemaLibrary/2006/main" mc:Ignorable="w14 w15 w16se w16cid w16 w16cex w16sdtdh">
-  <w:zoom w:percent="100"/>
-  <w:activeWritingStyle w:appName="MSWord" w:lang="ru-RU" w:vendorID="64" w:dllVersion="131078" w:nlCheck="1" w:checkStyle="0"/>
-  <w:activeWritingStyle w:appName="MSWord" w:lang="en-US" w:vendorID="64" w:dllVersion="131078" w:nlCheck="1" w:checkStyle="0"/>
-  <w:activeWritingStyle w:appName="MSWord" w:lang="en-GB" w:vendorID="64" w:dllVersion="131078" w:nlCheck="1" w:checkStyle="0"/>
-  <w:proofState w:spelling="clean" w:grammar="clean"/>
-  <w:doNotTrackMoves/>
-  <w:defaultTabStop w:val="708"/>
-  <w:characterSpacingControl w:val="doNotCompress"/>
-  <w:footnotePr>
-    <w:footnote w:id="-1"/>
-    <w:footnote w:id="0"/>
-  </w:footnotePr>
-  <w:endnotePr>
-    <w:endnote w:id="-1"/>
-    <w:endnote w:id="0"/>
-  </w:endnotePr>
-  <w:compat>
-    <w:useNormalStyleForList/>
-    <w:doNotUseIndentAsNumberingTabStop/>
-    <w:useAltKinsokuLineBreakRules/>
-    <w:allowSpaceOfSameStyleInTable/>
-    <w:doNotSuppressIndentation/>
-    <w:doNotAutofitConstrainedTables/>
-    <w:autofitToFirstFixedWidthCell/>
-    <w:displayHangulFixedWidth/>
-    <w:splitPgBreakAndParaMark/>
-    <w:doNotVertAlignCellWithSp/>
-    <w:doNotBreakConstrainedForcedTable/>
-    <w:doNotVertAlignInTxbx/>
-    <w:useAnsiKerningPairs/>
-    <w:cachedColBalance/>
-    <w:compatSetting w:name="compatibilityMode" w:uri="http://schemas.microsoft.com/office/word" w:val="11"/>
-    <w:compatSetting w:name="allowHyphenationAtTrackBottom" w:uri="http://schemas.microsoft.com/office/word" w:val="1"/>
-    <w:compatSetting w:name="useWord2013TrackBottomHyphenation" w:uri="http://schemas.microsoft.com/office/word" w:val="1"/>
-  </w:compat>
-  <w:rsids>
-    <w:rsidRoot w:val="00146772"/>
-    <w:rsid w:val="00001F70"/>
-    <w:rsid w:val="00026D10"/>
-    <w:rsid w:val="00032349"/>
-    <w:rsid w:val="000363C1"/>
-    <w:rsid w:val="0004617B"/>
-    <w:rsid w:val="00051888"/>
-    <w:rsid w:val="00071411"/>
-    <w:rsid w:val="00080F56"/>
-    <w:rsid w:val="00084193"/>
-    <w:rsid w:val="00084EA3"/>
-    <w:rsid w:val="00087274"/>
-    <w:rsid w:val="000A7F4D"/>
-    <w:rsid w:val="000B2836"/>
-    <w:rsid w:val="000C6518"/>
-    <w:rsid w:val="000D000E"/>
-    <w:rsid w:val="000D2979"/>
-    <w:rsid w:val="000E6C0C"/>
-    <w:rsid w:val="00104171"/>
-    <w:rsid w:val="001124C3"/>
-    <w:rsid w:val="001128DD"/>
-    <w:rsid w:val="0012799A"/>
-    <w:rsid w:val="0013280D"/>
-    <w:rsid w:val="00146772"/>
-    <w:rsid w:val="00147631"/>
-    <w:rsid w:val="00151F15"/>
-    <w:rsid w:val="0015246F"/>
-    <w:rsid w:val="001540F6"/>
-    <w:rsid w:val="00154E3E"/>
-    <w:rsid w:val="0016187D"/>
-    <w:rsid w:val="00166D88"/>
-    <w:rsid w:val="00170D7D"/>
-    <w:rsid w:val="001770B8"/>
-    <w:rsid w:val="001775E6"/>
-    <w:rsid w:val="0018256C"/>
-    <w:rsid w:val="001A6A84"/>
-    <w:rsid w:val="001B1493"/>
-    <w:rsid w:val="001B2096"/>
-    <w:rsid w:val="001B2F70"/>
-    <w:rsid w:val="001B4C84"/>
-    <w:rsid w:val="001D13E1"/>
-    <w:rsid w:val="001D16D4"/>
-    <w:rsid w:val="001F73EB"/>
-    <w:rsid w:val="001F780D"/>
-    <w:rsid w:val="002040D0"/>
-    <w:rsid w:val="00204CC3"/>
-    <w:rsid w:val="00223189"/>
-    <w:rsid w:val="0022763D"/>
-    <w:rsid w:val="002345FB"/>
-    <w:rsid w:val="00252B1B"/>
-    <w:rsid w:val="00254041"/>
-    <w:rsid w:val="00254748"/>
-    <w:rsid w:val="00266817"/>
-    <w:rsid w:val="0028275B"/>
-    <w:rsid w:val="0028622A"/>
-    <w:rsid w:val="002A0C3D"/>
-    <w:rsid w:val="002A31D2"/>
-    <w:rsid w:val="002B6649"/>
-    <w:rsid w:val="002C221A"/>
-    <w:rsid w:val="002C3C0E"/>
-    <w:rsid w:val="002D001B"/>
-    <w:rsid w:val="002E6C0F"/>
-    <w:rsid w:val="002F057F"/>
-    <w:rsid w:val="002F0D80"/>
-    <w:rsid w:val="00302282"/>
-    <w:rsid w:val="00313AB3"/>
-    <w:rsid w:val="00326CBC"/>
-    <w:rsid w:val="00332EB8"/>
-    <w:rsid w:val="003449DB"/>
-    <w:rsid w:val="00386F04"/>
-    <w:rsid w:val="00390BBD"/>
-    <w:rsid w:val="00397CDA"/>
-    <w:rsid w:val="003A19D5"/>
-    <w:rsid w:val="003C4BD7"/>
-    <w:rsid w:val="003E510C"/>
-    <w:rsid w:val="003E5D0B"/>
-    <w:rsid w:val="003F59B7"/>
-    <w:rsid w:val="004077B0"/>
-    <w:rsid w:val="004118F5"/>
-    <w:rsid w:val="004127C8"/>
-    <w:rsid w:val="00412D81"/>
-    <w:rsid w:val="00414F54"/>
-    <w:rsid w:val="004440E2"/>
-    <w:rsid w:val="00475558"/>
-    <w:rsid w:val="00477F49"/>
-    <w:rsid w:val="004943B6"/>
-    <w:rsid w:val="004B3B92"/>
-    <w:rsid w:val="004B6C94"/>
-    <w:rsid w:val="004C2552"/>
-    <w:rsid w:val="004E5D3F"/>
-    <w:rsid w:val="004F6DBA"/>
-    <w:rsid w:val="0050272D"/>
-    <w:rsid w:val="00502A7D"/>
-    <w:rsid w:val="00504E1D"/>
-    <w:rsid w:val="0050567B"/>
-    <w:rsid w:val="005102B5"/>
-    <w:rsid w:val="00527BFF"/>
-    <w:rsid w:val="00532382"/>
-    <w:rsid w:val="005668FF"/>
-    <w:rsid w:val="0057607A"/>
-    <w:rsid w:val="00580E37"/>
-    <w:rsid w:val="005C5975"/>
-    <w:rsid w:val="005C6372"/>
-    <w:rsid w:val="005D5334"/>
-    <w:rsid w:val="005E106B"/>
-    <w:rsid w:val="005E2A1C"/>
-    <w:rsid w:val="005E5B40"/>
-    <w:rsid w:val="005F199D"/>
-    <w:rsid w:val="005F24B7"/>
-    <w:rsid w:val="005F2688"/>
-    <w:rsid w:val="00606B12"/>
-    <w:rsid w:val="006102A6"/>
-    <w:rsid w:val="00644AA3"/>
-    <w:rsid w:val="00661A5B"/>
-    <w:rsid w:val="006633FE"/>
-    <w:rsid w:val="00671788"/>
-    <w:rsid w:val="006811DD"/>
-    <w:rsid w:val="006A7E72"/>
-    <w:rsid w:val="006C4756"/>
-    <w:rsid w:val="006C713D"/>
-    <w:rsid w:val="006E4809"/>
-    <w:rsid w:val="006F320A"/>
-    <w:rsid w:val="006F4772"/>
-    <w:rsid w:val="007000EA"/>
-    <w:rsid w:val="00707D83"/>
-    <w:rsid w:val="00714444"/>
-    <w:rsid w:val="00715C3D"/>
-    <w:rsid w:val="007267E2"/>
-    <w:rsid w:val="0074531F"/>
-    <w:rsid w:val="007476C0"/>
-    <w:rsid w:val="00751F2B"/>
-    <w:rsid w:val="00753D1D"/>
-    <w:rsid w:val="00770D61"/>
-    <w:rsid w:val="00783537"/>
-    <w:rsid w:val="00784284"/>
-    <w:rsid w:val="00785436"/>
-    <w:rsid w:val="0079710A"/>
-    <w:rsid w:val="007B506E"/>
-    <w:rsid w:val="007C2131"/>
-    <w:rsid w:val="007E5DEB"/>
-    <w:rsid w:val="007F06FD"/>
-    <w:rsid w:val="007F0A1E"/>
-    <w:rsid w:val="007F2B26"/>
-    <w:rsid w:val="007F5C7D"/>
-    <w:rsid w:val="00807BE3"/>
-    <w:rsid w:val="008135B3"/>
-    <w:rsid w:val="00820A44"/>
-    <w:rsid w:val="008372FF"/>
-    <w:rsid w:val="00840D02"/>
-    <w:rsid w:val="00842527"/>
-    <w:rsid w:val="00846EBE"/>
-    <w:rsid w:val="00853D25"/>
-    <w:rsid w:val="0085570C"/>
-    <w:rsid w:val="008602B5"/>
-    <w:rsid w:val="00864E09"/>
-    <w:rsid w:val="00872BFD"/>
-    <w:rsid w:val="0087448F"/>
-    <w:rsid w:val="008778A7"/>
-    <w:rsid w:val="00882718"/>
-    <w:rsid w:val="00883715"/>
-    <w:rsid w:val="00885559"/>
-    <w:rsid w:val="00896346"/>
-    <w:rsid w:val="008B3D12"/>
-    <w:rsid w:val="008B725E"/>
-    <w:rsid w:val="008D345D"/>
-    <w:rsid w:val="008D625A"/>
-    <w:rsid w:val="008D6582"/>
-    <w:rsid w:val="008F285F"/>
-    <w:rsid w:val="00910BDA"/>
-    <w:rsid w:val="00915603"/>
-    <w:rsid w:val="00930852"/>
-    <w:rsid w:val="00951611"/>
-    <w:rsid w:val="009612B4"/>
-    <w:rsid w:val="009972D0"/>
-    <w:rsid w:val="009A16C6"/>
-    <w:rsid w:val="009B3BB7"/>
-    <w:rsid w:val="009B6082"/>
-    <w:rsid w:val="009E39A0"/>
-    <w:rsid w:val="009F0368"/>
-    <w:rsid w:val="009F34E0"/>
-    <w:rsid w:val="00A0129E"/>
-    <w:rsid w:val="00A2336F"/>
-    <w:rsid w:val="00A43951"/>
-    <w:rsid w:val="00A47DBC"/>
-    <w:rsid w:val="00A673CA"/>
-    <w:rsid w:val="00A737E2"/>
-    <w:rsid w:val="00A8245C"/>
-    <w:rsid w:val="00A825DB"/>
-    <w:rsid w:val="00A862B4"/>
-    <w:rsid w:val="00A9103A"/>
-    <w:rsid w:val="00AC4FA0"/>
-    <w:rsid w:val="00AD240B"/>
-    <w:rsid w:val="00AE02E6"/>
-    <w:rsid w:val="00AE2C9F"/>
-    <w:rsid w:val="00AE4910"/>
-    <w:rsid w:val="00AE65DF"/>
-    <w:rsid w:val="00AF46CD"/>
-    <w:rsid w:val="00AF4D37"/>
-    <w:rsid w:val="00B01820"/>
-    <w:rsid w:val="00B047AE"/>
-    <w:rsid w:val="00B07D51"/>
-    <w:rsid w:val="00B162CD"/>
-    <w:rsid w:val="00B525D6"/>
-    <w:rsid w:val="00B63A11"/>
-    <w:rsid w:val="00B740FC"/>
-    <w:rsid w:val="00B8205F"/>
-    <w:rsid w:val="00BA3D6F"/>
-    <w:rsid w:val="00BB4BA4"/>
-    <w:rsid w:val="00BD5B2F"/>
-    <w:rsid w:val="00BF381F"/>
-    <w:rsid w:val="00C0170D"/>
-    <w:rsid w:val="00C10746"/>
-    <w:rsid w:val="00C10A61"/>
-    <w:rsid w:val="00C10F47"/>
-    <w:rsid w:val="00C43DE0"/>
-    <w:rsid w:val="00C45D19"/>
-    <w:rsid w:val="00C55CC2"/>
-    <w:rsid w:val="00C66D34"/>
-    <w:rsid w:val="00C7369C"/>
-    <w:rsid w:val="00C74DCF"/>
-    <w:rsid w:val="00C84359"/>
-    <w:rsid w:val="00CB75F2"/>
-    <w:rsid w:val="00CC4C3C"/>
-    <w:rsid w:val="00CC7394"/>
-    <w:rsid w:val="00CD320C"/>
-    <w:rsid w:val="00CD464B"/>
-    <w:rsid w:val="00CD7DB2"/>
-    <w:rsid w:val="00CE417D"/>
-    <w:rsid w:val="00CE6EE3"/>
-    <w:rsid w:val="00CF0993"/>
-    <w:rsid w:val="00D0062D"/>
-    <w:rsid w:val="00D05E99"/>
-    <w:rsid w:val="00D47B7E"/>
-    <w:rsid w:val="00D54FCF"/>
-    <w:rsid w:val="00D774CF"/>
-    <w:rsid w:val="00D8331D"/>
-    <w:rsid w:val="00D90DB2"/>
-    <w:rsid w:val="00DA4BB4"/>
-    <w:rsid w:val="00DB4D3E"/>
-    <w:rsid w:val="00DC0BC1"/>
-    <w:rsid w:val="00DC4432"/>
-    <w:rsid w:val="00DC597A"/>
-    <w:rsid w:val="00DD53C8"/>
-    <w:rsid w:val="00DE6201"/>
-    <w:rsid w:val="00E13FFA"/>
-    <w:rsid w:val="00E16A51"/>
-    <w:rsid w:val="00E22825"/>
-    <w:rsid w:val="00E2332A"/>
-    <w:rsid w:val="00E343F8"/>
-    <w:rsid w:val="00E43973"/>
-    <w:rsid w:val="00E53BB4"/>
-    <w:rsid w:val="00E56992"/>
-    <w:rsid w:val="00E74815"/>
-    <w:rsid w:val="00E82325"/>
-    <w:rsid w:val="00EB0E1F"/>
-    <w:rsid w:val="00EC1D47"/>
-    <w:rsid w:val="00EC399C"/>
-    <w:rsid w:val="00EF3061"/>
-    <w:rsid w:val="00EF7576"/>
-    <w:rsid w:val="00F01A85"/>
-    <w:rsid w:val="00F0542C"/>
-    <w:rsid w:val="00F2618A"/>
-    <w:rsid w:val="00F41DA5"/>
-    <w:rsid w:val="00F503FB"/>
-    <w:rsid w:val="00F616C3"/>
-    <w:rsid w:val="00F746C3"/>
-    <w:rsid w:val="00F85372"/>
-    <w:rsid w:val="00FA57A1"/>
-    <w:rsid w:val="00FB0D59"/>
-    <w:rsid w:val="00FB64B6"/>
-    <w:rsid w:val="00FC7FD0"/>
-    <w:rsid w:val="00FF64FC"/>
-  </w:rsids>
-  <m:mathPr>
-    <m:mathFont m:val="Cambria Math"/>
-    <m:brkBin m:val="before"/>
-    <m:brkBinSub m:val="--"/>
-    <m:smallFrac m:val="0"/>
-    <m:dispDef/>
-    <m:lMargin m:val="0"/>
-    <m:rMargin m:val="0"/>
-    <m:defJc m:val="centerGroup"/>
-    <m:wrapIndent m:val="1440"/>
-    <m:intLim m:val="subSup"/>
-    <m:naryLim m:val="undOvr"/>
-  </m:mathPr>
-  <w:themeFontLang w:val="en-US"/>
-  <w:clrSchemeMapping w:bg1="light1" w:t1="dark1" w:bg2="light2" w:t2="dark2" w:accent1="accent1" w:accent2="accent2" w:accent3="accent3" w:accent4="accent4" w:accent5="accent5" w:accent6="accent6" w:hyperlink="hyperlink" w:followedHyperlink="followedHyperlink"/>
-  <w:shapeDefaults>
-    <o:shapedefaults v:ext="edit" spidmax="2050"/>
-    <o:shapelayout v:ext="edit">
-      <o:idmap v:ext="edit" data="1"/>
-    </o:shapelayout>
-  </w:shapeDefaults>
-  <w:decimalSymbol w:val="."/>
-  <w:listSeparator w:val=","/>
-  <w14:docId w14:val="2460746A"/>
-  <w15:chartTrackingRefBased/>
-  <w15:docId w15:val="{5CFDDB50-3F95-44D2-A91E-4637B77263CA}"/>
-</w:settings>
-</file>
-
-<file path=word\styles.xml><?xml version="1.0" encoding="utf-8"?>
+<file path=word/styles.xml><?xml version="1.0" encoding="utf-8"?>
 <w:styles xmlns:mc="http://schemas.openxmlformats.org/markup-compatibility/2006" xmlns:r="http://schemas.openxmlformats.org/officeDocument/2006/relationships" xmlns:w="http://schemas.openxmlformats.org/wordprocessingml/2006/main" xmlns:w14="http://schemas.microsoft.com/office/word/2010/wordml" xmlns:w15="http://schemas.microsoft.com/office/word/2012/wordml" xmlns:w16cex="http://schemas.microsoft.com/office/word/2018/wordml/cex" xmlns:w16cid="http://schemas.microsoft.com/office/word/2016/wordml/cid" xmlns:w16="http://schemas.microsoft.com/office/word/2018/wordml" xmlns:w16sdtdh="http://schemas.microsoft.com/office/word/2020/wordml/sdtdatahash" xmlns:w16se="http://schemas.microsoft.com/office/word/2015/wordml/symex" mc:Ignorable="w14 w15 w16se w16cid w16 w16cex w16sdtdh">
   <w:docDefaults>
     <w:rPrDefault>
@@ -13833,7 +13377,7 @@
 </w:styles>
 </file>
 
-<file path=word\theme\theme1.xml><?xml version="1.0" encoding="utf-8"?>
+<file path=word/theme/theme1.xml><?xml version="1.0" encoding="utf-8"?>
 <a:theme xmlns:a="http://schemas.openxmlformats.org/drawingml/2006/main" name="Office Theme">
   <a:themeElements>
     <a:clrScheme name="Office">
@@ -14126,39 +13670,4 @@
     </a:ext>
   </a:extLst>
 </a:theme>
-</file>
-
-<file path=word\webSettings.xml><?xml version="1.0" encoding="utf-8"?>
-<w:webSettings xmlns:mc="http://schemas.openxmlformats.org/markup-compatibility/2006" xmlns:r="http://schemas.openxmlformats.org/officeDocument/2006/relationships" xmlns:w="http://schemas.openxmlformats.org/wordprocessingml/2006/main" xmlns:w14="http://schemas.microsoft.com/office/word/2010/wordml" xmlns:w15="http://schemas.microsoft.com/office/word/2012/wordml" xmlns:w16cex="http://schemas.microsoft.com/office/word/2018/wordml/cex" xmlns:w16cid="http://schemas.microsoft.com/office/word/2016/wordml/cid" xmlns:w16="http://schemas.microsoft.com/office/word/2018/wordml" xmlns:w16sdtdh="http://schemas.microsoft.com/office/word/2020/wordml/sdtdatahash" xmlns:w16se="http://schemas.microsoft.com/office/word/2015/wordml/symex" mc:Ignorable="w14 w15 w16se w16cid w16 w16cex w16sdtdh">
-  <w:divs>
-    <w:div w:id="1365401751">
-      <w:bodyDiv w:val="1"/>
-      <w:marLeft w:val="0"/>
-      <w:marRight w:val="0"/>
-      <w:marTop w:val="0"/>
-      <w:marBottom w:val="0"/>
-      <w:divBdr>
-        <w:top w:val="none" w:sz="0" w:space="0" w:color="auto"/>
-        <w:left w:val="none" w:sz="0" w:space="0" w:color="auto"/>
-        <w:bottom w:val="none" w:sz="0" w:space="0" w:color="auto"/>
-        <w:right w:val="none" w:sz="0" w:space="0" w:color="auto"/>
-      </w:divBdr>
-    </w:div>
-    <w:div w:id="1789928961">
-      <w:bodyDiv w:val="1"/>
-      <w:marLeft w:val="0"/>
-      <w:marRight w:val="0"/>
-      <w:marTop w:val="0"/>
-      <w:marBottom w:val="0"/>
-      <w:divBdr>
-        <w:top w:val="none" w:sz="0" w:space="0" w:color="auto"/>
-        <w:left w:val="none" w:sz="0" w:space="0" w:color="auto"/>
-        <w:bottom w:val="none" w:sz="0" w:space="0" w:color="auto"/>
-        <w:right w:val="none" w:sz="0" w:space="0" w:color="auto"/>
-      </w:divBdr>
-    </w:div>
-  </w:divs>
-  <w:optimizeForBrowser/>
-  <w:allowPNG/>
-</w:webSettings>
 </file>
</xml_diff>